<commit_message>
Update Arb translation data to 2026-08-06
</commit_message>
<xml_diff>
--- a/eng/docx/022.content.docx
+++ b/eng/docx/022.content.docx
@@ -127,7 +127,7 @@
         <w:rPr>
           <w:lang w:val="en_US" w:bidi="en_US"/>
         </w:rPr>
-        <w:t>U</w:t>
+        <w:t>V</w:t>
       </w:r>
       <w:r>
         <w:rPr>
@@ -190,7 +190,7 @@
         <w:rPr>
           <w:lang w:val="en_US" w:bidi="en_US"/>
         </w:rPr>
-        <w:t>Understand</w:t>
+        <w:t>vain, vanity</w:t>
       </w:r>
       <w:r>
         <w:rPr>
@@ -208,6 +208,11 @@
         </w:rPr>
         <w:t>Definition:</w:t>
       </w:r>
+      <w:r>
+        <w:rPr>
+          <w:lang w:val="en_US" w:bidi="en_US"/>
+        </w:rPr>
+      </w:r>
     </w:p>
     <w:p>
       <w:pPr/>
@@ -220,7 +225,17 @@
         <w:rPr>
           <w:lang w:val="en_US" w:bidi="en_US"/>
         </w:rPr>
-        <w:t>The term “understand” means to hear or receive information and know what it means.</w:t>
+        <w:t>The terms “vain” and “vanity” describe something that is useless or extremely temporary.</w:t>
+      </w:r>
+      <w:r>
+        <w:rPr>
+          <w:lang w:val="en_US" w:bidi="en_US"/>
+        </w:rPr>
+      </w:r>
+      <w:r>
+        <w:rPr>
+          <w:lang w:val="en_US" w:bidi="en_US"/>
+        </w:rPr>
       </w:r>
     </w:p>
     <w:p>
@@ -238,7 +253,12 @@
         <w:rPr>
           <w:lang w:val="en_US" w:bidi="en_US"/>
         </w:rPr>
-        <w:t>The term “understanding” can refer to “knowledge” or “wisdom” or realizing how to do something.</w:t>
+        <w:t>In the Old Testament, idols are sometimes described as “vain” things that are worthless and cannot do anything.</w:t>
+      </w:r>
+      <w:r>
+        <w:rPr>
+          <w:lang w:val="en_US" w:bidi="en_US"/>
+        </w:rPr>
       </w:r>
     </w:p>
     <w:p>
@@ -256,7 +276,12 @@
         <w:rPr>
           <w:lang w:val="en_US" w:bidi="en_US"/>
         </w:rPr>
-        <w:t>To understand someone can also mean to know how that person is feeling.</w:t>
+        <w:t>If something is done “in vain,” it means that there the effort or action did not accomplish what was intended. The phrase “in vain” might be translated in various ways, including: “without result;” “with no result;” “for no reason;” “for no purpose,” or “with no purpose.”</w:t>
+      </w:r>
+      <w:r>
+        <w:rPr>
+          <w:lang w:val="en_US" w:bidi="en_US"/>
+        </w:rPr>
       </w:r>
     </w:p>
     <w:p>
@@ -274,7 +299,69 @@
         <w:rPr>
           <w:lang w:val="en_US" w:bidi="en_US"/>
         </w:rPr>
-        <w:t>While walking on the road to Emmaus, Jesus caused the disciples to understand the meaning of the scriptures about the Messiah.</w:t>
+        <w:t>Depending on the context, the term “vain” could be translated as “empty,” “useless,” “hopeless,” “worthless,” “meaningless,” etc.</w:t>
+      </w:r>
+      <w:r>
+        <w:rPr>
+          <w:lang w:val="en_US" w:bidi="en_US"/>
+        </w:rPr>
+      </w:r>
+      <w:r>
+        <w:rPr>
+          <w:lang w:val="en_US" w:bidi="en_US"/>
+        </w:rPr>
+      </w:r>
+    </w:p>
+    <w:p>
+      <w:pPr/>
+      <w:r>
+        <w:rPr>
+          <w:lang w:val="en_US" w:bidi="en_US"/>
+        </w:rPr>
+      </w:r>
+      <w:r>
+        <w:rPr>
+          <w:lang w:val="en_US" w:bidi="en_US"/>
+        </w:rPr>
+        <w:t xml:space="preserve">(See also: </w:t>
+      </w:r>
+      <w:r>
+        <w:rPr>
+          <w:lang w:val="en_US" w:bidi="en_US"/>
+        </w:rPr>
+        <w:t>false god</w:t>
+      </w:r>
+      <w:r>
+        <w:rPr>
+          <w:lang w:val="en_US" w:bidi="en_US"/>
+        </w:rPr>
+        <w:t>, worthy)</w:t>
+      </w:r>
+      <w:r>
+        <w:rPr>
+          <w:lang w:val="en_US" w:bidi="en_US"/>
+        </w:rPr>
+      </w:r>
+    </w:p>
+    <w:p>
+      <w:pPr>
+        <w:pStyle w:val="Heading3"/>
+      </w:pPr>
+      <w:r>
+        <w:rPr>
+          <w:lang w:val="en_US" w:bidi="en_US"/>
+        </w:rPr>
+        <w:t>Bible References:</w:t>
+      </w:r>
+      <w:r>
+        <w:rPr>
+          <w:lang w:val="en_US" w:bidi="en_US"/>
+        </w:rPr>
+      </w:r>
+      <w:r>
+        <w:rPr>
+          <w:lang w:val="en_US" w:bidi="en_US"/>
+        </w:rPr>
       </w:r>
     </w:p>
     <w:p>
@@ -292,7 +379,12 @@
         <w:rPr>
           <w:lang w:val="en_US" w:bidi="en_US"/>
         </w:rPr>
-        <w:t>Depending on the context, the term “understand” could be translated by “know” or “believe” or “comprehend” or “know what (something) means.”</w:t>
+        <w:t>1 Corinthians 15:1–2</w:t>
+      </w:r>
+      <w:r>
+        <w:rPr>
+          <w:lang w:val="en_US" w:bidi="en_US"/>
+        </w:rPr>
       </w:r>
     </w:p>
     <w:p>
@@ -310,68 +402,12 @@
         <w:rPr>
           <w:lang w:val="en_US" w:bidi="en_US"/>
         </w:rPr>
-        <w:t>Often the term “understanding” can be translated by “knowledge” or “wisdom” or “insight.”</w:t>
-      </w:r>
-    </w:p>
-    <w:p>
-      <w:pPr/>
-      <w:r>
-        <w:rPr>
-          <w:lang w:val="en_US" w:bidi="en_US"/>
-        </w:rPr>
-      </w:r>
-      <w:r>
-        <w:rPr>
-          <w:lang w:val="en_US" w:bidi="en_US"/>
-        </w:rPr>
-        <w:t xml:space="preserve">(See also: </w:t>
-      </w:r>
-      <w:r>
-        <w:rPr>
-          <w:lang w:val="en_US" w:bidi="en_US"/>
-        </w:rPr>
-        <w:t>believe</w:t>
-      </w:r>
-      <w:r>
-        <w:rPr>
-          <w:lang w:val="en_US" w:bidi="en_US"/>
-        </w:rPr>
-        <w:t xml:space="preserve">, </w:t>
-      </w:r>
-      <w:r>
-        <w:rPr>
-          <w:lang w:val="en_US" w:bidi="en_US"/>
-        </w:rPr>
-        <w:t>know</w:t>
-      </w:r>
-      <w:r>
-        <w:rPr>
-          <w:lang w:val="en_US" w:bidi="en_US"/>
-        </w:rPr>
-        <w:t xml:space="preserve">, </w:t>
-      </w:r>
-      <w:r>
-        <w:rPr>
-          <w:lang w:val="en_US" w:bidi="en_US"/>
-        </w:rPr>
-        <w:t>wise</w:t>
-      </w:r>
-      <w:r>
-        <w:rPr>
-          <w:lang w:val="en_US" w:bidi="en_US"/>
-        </w:rPr>
-        <w:t>)</w:t>
-      </w:r>
-    </w:p>
-    <w:p>
-      <w:pPr>
-        <w:pStyle w:val="Heading3"/>
-      </w:pPr>
-      <w:r>
-        <w:rPr>
-          <w:lang w:val="en_US" w:bidi="en_US"/>
-        </w:rPr>
-        <w:t>Bible References:</w:t>
+        <w:t>1 Samuel 25:21–22</w:t>
+      </w:r>
+      <w:r>
+        <w:rPr>
+          <w:lang w:val="en_US" w:bidi="en_US"/>
+        </w:rPr>
       </w:r>
     </w:p>
     <w:p>
@@ -385,18 +421,17 @@
           <w:lang w:val="en_US" w:bidi="en_US"/>
         </w:rPr>
       </w:r>
-      <w:hyperlink r:id="rId13">
-        <w:r>
-          <w:rPr>
-            <w:lang w:val="en_US" w:bidi="en_US"/>
-          </w:rPr>
-          <w:rPr>
-            <w:color w:val="0000EE"/>
-            <w:u w:val="single"/>
-          </w:rPr>
-          <w:t>Job 34:16–17</w:t>
-        </w:r>
-      </w:hyperlink>
+      <w:r>
+        <w:rPr>
+          <w:lang w:val="en_US" w:bidi="en_US"/>
+        </w:rPr>
+        <w:t>2 Peter 2:18</w:t>
+      </w:r>
+      <w:r>
+        <w:rPr>
+          <w:lang w:val="en_US" w:bidi="en_US"/>
+        </w:rPr>
+      </w:r>
     </w:p>
     <w:p>
       <w:pPr>
@@ -409,18 +444,17 @@
           <w:lang w:val="en_US" w:bidi="en_US"/>
         </w:rPr>
       </w:r>
-      <w:hyperlink r:id="rId14">
-        <w:r>
-          <w:rPr>
-            <w:lang w:val="en_US" w:bidi="en_US"/>
-          </w:rPr>
-          <w:rPr>
-            <w:color w:val="0000EE"/>
-            <w:u w:val="single"/>
-          </w:rPr>
-          <w:t>Luke 2:47</w:t>
-        </w:r>
-      </w:hyperlink>
+      <w:r>
+        <w:rPr>
+          <w:lang w:val="en_US" w:bidi="en_US"/>
+        </w:rPr>
+        <w:t>Isaiah 45:19</w:t>
+      </w:r>
+      <w:r>
+        <w:rPr>
+          <w:lang w:val="en_US" w:bidi="en_US"/>
+        </w:rPr>
+      </w:r>
     </w:p>
     <w:p>
       <w:pPr>
@@ -433,18 +467,17 @@
           <w:lang w:val="en_US" w:bidi="en_US"/>
         </w:rPr>
       </w:r>
-      <w:hyperlink r:id="rId15">
-        <w:r>
-          <w:rPr>
-            <w:lang w:val="en_US" w:bidi="en_US"/>
-          </w:rPr>
-          <w:rPr>
-            <w:color w:val="0000EE"/>
-            <w:u w:val="single"/>
-          </w:rPr>
-          <w:t>Luke 8:10</w:t>
-        </w:r>
-      </w:hyperlink>
+      <w:r>
+        <w:rPr>
+          <w:lang w:val="en_US" w:bidi="en_US"/>
+        </w:rPr>
+        <w:t>Jeremiah 2:29–31</w:t>
+      </w:r>
+      <w:r>
+        <w:rPr>
+          <w:lang w:val="en_US" w:bidi="en_US"/>
+        </w:rPr>
+      </w:r>
     </w:p>
     <w:p>
       <w:pPr>
@@ -457,18 +490,43 @@
           <w:lang w:val="en_US" w:bidi="en_US"/>
         </w:rPr>
       </w:r>
-      <w:hyperlink r:id="rId16">
-        <w:r>
-          <w:rPr>
-            <w:lang w:val="en_US" w:bidi="en_US"/>
-          </w:rPr>
-          <w:rPr>
-            <w:color w:val="0000EE"/>
-            <w:u w:val="single"/>
-          </w:rPr>
-          <w:t>Matthew 13:12</w:t>
-        </w:r>
-      </w:hyperlink>
+      <w:r>
+        <w:rPr>
+          <w:lang w:val="en_US" w:bidi="en_US"/>
+        </w:rPr>
+        <w:t>Matthew 15:9</w:t>
+      </w:r>
+      <w:r>
+        <w:rPr>
+          <w:lang w:val="en_US" w:bidi="en_US"/>
+        </w:rPr>
+      </w:r>
+      <w:r>
+        <w:rPr>
+          <w:lang w:val="en_US" w:bidi="en_US"/>
+        </w:rPr>
+      </w:r>
+    </w:p>
+    <w:p>
+      <w:pPr>
+        <w:pStyle w:val="Heading3"/>
+      </w:pPr>
+      <w:r>
+        <w:rPr>
+          <w:lang w:val="en_US" w:bidi="en_US"/>
+        </w:rPr>
+        <w:t>Word Data:</w:t>
+      </w:r>
+      <w:r>
+        <w:rPr>
+          <w:lang w:val="en_US" w:bidi="en_US"/>
+        </w:rPr>
+      </w:r>
+      <w:r>
+        <w:rPr>
+          <w:lang w:val="en_US" w:bidi="en_US"/>
+        </w:rPr>
+      </w:r>
     </w:p>
     <w:p>
       <w:pPr>
@@ -481,18 +539,91 @@
           <w:lang w:val="en_US" w:bidi="en_US"/>
         </w:rPr>
       </w:r>
-      <w:hyperlink r:id="rId17">
-        <w:r>
-          <w:rPr>
-            <w:lang w:val="en_US" w:bidi="en_US"/>
-          </w:rPr>
-          <w:rPr>
-            <w:color w:val="0000EE"/>
-            <w:u w:val="single"/>
-          </w:rPr>
-          <w:t>Matthew 13:14</w:t>
-        </w:r>
-      </w:hyperlink>
+      <w:r>
+        <w:rPr>
+          <w:lang w:val="en_US" w:bidi="en_US"/>
+        </w:rPr>
+        <w:t>Strong’s: H1891, H1892, H2600, H7307, H7385, H7387, H7723, H8193, H8267, H8414, G09450, G15000, G27560, G27580, G27610, G31510, G31520, G31530, G31550</w:t>
+      </w:r>
+      <w:r>
+        <w:rPr>
+          <w:lang w:val="en_US" w:bidi="en_US"/>
+        </w:rPr>
+      </w:r>
+      <w:r>
+        <w:rPr>
+          <w:lang w:val="en_US" w:bidi="en_US"/>
+        </w:rPr>
+      </w:r>
+      <w:r>
+        <w:rPr>
+          <w:lang w:val="en_US" w:bidi="en_US"/>
+        </w:rPr>
+      </w:r>
+    </w:p>
+    <w:p>
+      <w:pPr/>
+      <w:r>
+        <w:rPr>
+          <w:lang w:val="en_US" w:bidi="en_US"/>
+        </w:rPr>
+      </w:r>
+    </w:p>
+    <w:p>
+      <w:pPr>
+        <w:pStyle w:val="Heading2"/>
+      </w:pPr>
+      <w:r>
+        <w:rPr>
+          <w:lang w:val="en_US" w:bidi="en_US"/>
+        </w:rPr>
+        <w:t>Vashti</w:t>
+      </w:r>
+      <w:r>
+        <w:rPr>
+          <w:lang w:val="en_US" w:bidi="en_US"/>
+        </w:rPr>
+      </w:r>
+    </w:p>
+    <w:p>
+      <w:pPr>
+        <w:pStyle w:val="Heading3"/>
+      </w:pPr>
+      <w:r>
+        <w:rPr>
+          <w:lang w:val="en_US" w:bidi="en_US"/>
+        </w:rPr>
+        <w:t>Definition:</w:t>
+      </w:r>
+      <w:r>
+        <w:rPr>
+          <w:lang w:val="en_US" w:bidi="en_US"/>
+        </w:rPr>
+      </w:r>
+    </w:p>
+    <w:p>
+      <w:pPr/>
+      <w:r>
+        <w:rPr>
+          <w:lang w:val="en_US" w:bidi="en_US"/>
+        </w:rPr>
+      </w:r>
+      <w:r>
+        <w:rPr>
+          <w:lang w:val="en_US" w:bidi="en_US"/>
+        </w:rPr>
+        <w:t>In the Old Testament book of Esther, Vashti was the wife of Ahasuerus, king of Persia.</w:t>
+      </w:r>
+      <w:r>
+        <w:rPr>
+          <w:lang w:val="en_US" w:bidi="en_US"/>
+        </w:rPr>
+      </w:r>
+      <w:r>
+        <w:rPr>
+          <w:lang w:val="en_US" w:bidi="en_US"/>
+        </w:rPr>
+      </w:r>
     </w:p>
     <w:p>
       <w:pPr>
@@ -505,28 +636,16 @@
           <w:lang w:val="en_US" w:bidi="en_US"/>
         </w:rPr>
       </w:r>
-      <w:hyperlink r:id="rId18">
-        <w:r>
-          <w:rPr>
-            <w:lang w:val="en_US" w:bidi="en_US"/>
-          </w:rPr>
-          <w:rPr>
-            <w:color w:val="0000EE"/>
-            <w:u w:val="single"/>
-          </w:rPr>
-          <w:t>Proverbs 3:5</w:t>
-        </w:r>
-      </w:hyperlink>
-    </w:p>
-    <w:p>
-      <w:pPr>
-        <w:pStyle w:val="Heading3"/>
-      </w:pPr>
-      <w:r>
-        <w:rPr>
-          <w:lang w:val="en_US" w:bidi="en_US"/>
-        </w:rPr>
-        <w:t>Word Data:</w:t>
+      <w:r>
+        <w:rPr>
+          <w:lang w:val="en_US" w:bidi="en_US"/>
+        </w:rPr>
+        <w:t>King Ahasuerus sent Queen Vashti away when she refused to obey his order to come to his dinner party and show off her beauty to his drunken guests.</w:t>
+      </w:r>
+      <w:r>
+        <w:rPr>
+          <w:lang w:val="en_US" w:bidi="en_US"/>
+        </w:rPr>
       </w:r>
     </w:p>
     <w:p>
@@ -544,7 +663,7 @@
         <w:rPr>
           <w:lang w:val="en_US" w:bidi="en_US"/>
         </w:rPr>
-        <w:t>Strong’s: H0995, H0998, H0999, H1847, H2940, H3045, H3820, H3824, H4486, H7200, H7919, H7922, H7924, H8085, H8394, G00500, G01450, G01910, G08010, G10970, G11080, G12710, G19210, G19220, G19870, G19900, G26570, G35390, G35630, G49070, G49080, G49200, G54240, G54280, G54290</w:t>
+        <w:t>As a result, a search went out for a new queen and eventually Esther was chosen to be the king’s new wife.</w:t>
       </w:r>
       <w:r>
         <w:rPr>
@@ -564,16 +683,66 @@
           <w:lang w:val="en_US" w:bidi="en_US"/>
         </w:rPr>
       </w:r>
-    </w:p>
-    <w:p>
-      <w:pPr>
-        <w:pStyle w:val="Heading2"/>
-      </w:pPr>
-      <w:r>
-        <w:rPr>
-          <w:lang w:val="en_US" w:bidi="en_US"/>
-        </w:rPr>
-        <w:t>Unleavened Bread</w:t>
+      <w:r>
+        <w:rPr>
+          <w:lang w:val="en_US" w:bidi="en_US"/>
+        </w:rPr>
+        <w:t>(Translation suggestions: Translate Names)</w:t>
+      </w:r>
+      <w:r>
+        <w:rPr>
+          <w:lang w:val="en_US" w:bidi="en_US"/>
+        </w:rPr>
+      </w:r>
+    </w:p>
+    <w:p>
+      <w:pPr/>
+      <w:r>
+        <w:rPr>
+          <w:lang w:val="en_US" w:bidi="en_US"/>
+        </w:rPr>
+      </w:r>
+      <w:r>
+        <w:rPr>
+          <w:lang w:val="en_US" w:bidi="en_US"/>
+        </w:rPr>
+        <w:t xml:space="preserve">(See also: </w:t>
+      </w:r>
+      <w:r>
+        <w:rPr>
+          <w:lang w:val="en_US" w:bidi="en_US"/>
+        </w:rPr>
+        <w:t>Ahasuerus</w:t>
+      </w:r>
+      <w:r>
+        <w:rPr>
+          <w:lang w:val="en_US" w:bidi="en_US"/>
+        </w:rPr>
+        <w:t xml:space="preserve">, </w:t>
+      </w:r>
+      <w:r>
+        <w:rPr>
+          <w:lang w:val="en_US" w:bidi="en_US"/>
+        </w:rPr>
+        <w:t>Esther</w:t>
+      </w:r>
+      <w:r>
+        <w:rPr>
+          <w:lang w:val="en_US" w:bidi="en_US"/>
+        </w:rPr>
+        <w:t xml:space="preserve">, </w:t>
+      </w:r>
+      <w:r>
+        <w:rPr>
+          <w:lang w:val="en_US" w:bidi="en_US"/>
+        </w:rPr>
+        <w:t>Persia</w:t>
+      </w:r>
+      <w:r>
+        <w:rPr>
+          <w:lang w:val="en_US" w:bidi="en_US"/>
+        </w:rPr>
+        <w:t>)</w:t>
       </w:r>
       <w:r>
         <w:rPr>
@@ -589,21 +758,17 @@
         <w:rPr>
           <w:lang w:val="en_US" w:bidi="en_US"/>
         </w:rPr>
-        <w:t>Definition:</w:t>
-      </w:r>
-    </w:p>
-    <w:p>
-      <w:pPr/>
-      <w:r>
-        <w:rPr>
-          <w:lang w:val="en_US" w:bidi="en_US"/>
-        </w:rPr>
-      </w:r>
-      <w:r>
-        <w:rPr>
-          <w:lang w:val="en_US" w:bidi="en_US"/>
-        </w:rPr>
-        <w:t>The term “unleavened bread” refers to bread that is made without yeast or other leavening. This kind of bread is flat because it has no leaven to make it rise.</w:t>
+        <w:t>Bible References:</w:t>
+      </w:r>
+      <w:r>
+        <w:rPr>
+          <w:lang w:val="en_US" w:bidi="en_US"/>
+        </w:rPr>
+      </w:r>
+      <w:r>
+        <w:rPr>
+          <w:lang w:val="en_US" w:bidi="en_US"/>
+        </w:rPr>
       </w:r>
     </w:p>
     <w:p>
@@ -621,7 +786,12 @@
         <w:rPr>
           <w:lang w:val="en_US" w:bidi="en_US"/>
         </w:rPr>
-        <w:t>When God freed the Israelites from slavery in Egypt, he told them to flee Egypt quickly without waiting for their bread to rise. So they ate unleavened bread with their meal. Since then unleavened bread is used in their yearly Passover celebrations to remind them of that time.</w:t>
+        <w:t>Esther 1:9–11</w:t>
+      </w:r>
+      <w:r>
+        <w:rPr>
+          <w:lang w:val="en_US" w:bidi="en_US"/>
+        </w:rPr>
       </w:r>
     </w:p>
     <w:p>
@@ -639,18 +809,12 @@
         <w:rPr>
           <w:lang w:val="en_US" w:bidi="en_US"/>
         </w:rPr>
-        <w:t>Since leaven sometimes is used as a picture of sin, “unleavened bread” represents the removal of sin from a person’s life in order to live in a way that honors God.</w:t>
-      </w:r>
-    </w:p>
-    <w:p>
-      <w:pPr>
-        <w:pStyle w:val="Heading3"/>
-      </w:pPr>
-      <w:r>
-        <w:rPr>
-          <w:lang w:val="en_US" w:bidi="en_US"/>
-        </w:rPr>
-        <w:t>Translation Suggestions:</w:t>
+        <w:t>Esther 2:1–2</w:t>
+      </w:r>
+      <w:r>
+        <w:rPr>
+          <w:lang w:val="en_US" w:bidi="en_US"/>
+        </w:rPr>
       </w:r>
     </w:p>
     <w:p>
@@ -668,7 +832,38 @@
         <w:rPr>
           <w:lang w:val="en_US" w:bidi="en_US"/>
         </w:rPr>
-        <w:t>Other ways to translate this term could include “bread with no yeast” or “flat bread that did not rise.”</w:t>
+        <w:t>Esther 2:17–18</w:t>
+      </w:r>
+      <w:r>
+        <w:rPr>
+          <w:lang w:val="en_US" w:bidi="en_US"/>
+        </w:rPr>
+      </w:r>
+      <w:r>
+        <w:rPr>
+          <w:lang w:val="en_US" w:bidi="en_US"/>
+        </w:rPr>
+      </w:r>
+    </w:p>
+    <w:p>
+      <w:pPr>
+        <w:pStyle w:val="Heading3"/>
+      </w:pPr>
+      <w:r>
+        <w:rPr>
+          <w:lang w:val="en_US" w:bidi="en_US"/>
+        </w:rPr>
+        <w:t>Word Data:</w:t>
+      </w:r>
+      <w:r>
+        <w:rPr>
+          <w:lang w:val="en_US" w:bidi="en_US"/>
+        </w:rPr>
+      </w:r>
+      <w:r>
+        <w:rPr>
+          <w:lang w:val="en_US" w:bidi="en_US"/>
+        </w:rPr>
       </w:r>
     </w:p>
     <w:p>
@@ -686,7 +881,86 @@
         <w:rPr>
           <w:lang w:val="en_US" w:bidi="en_US"/>
         </w:rPr>
-        <w:t>Make sure the translation of this term is consistent with how you translate the term “yeast, leaven.”</w:t>
+        <w:t>Strong’s: H2060</w:t>
+      </w:r>
+      <w:r>
+        <w:rPr>
+          <w:lang w:val="en_US" w:bidi="en_US"/>
+        </w:rPr>
+      </w:r>
+      <w:r>
+        <w:rPr>
+          <w:lang w:val="en_US" w:bidi="en_US"/>
+        </w:rPr>
+      </w:r>
+      <w:r>
+        <w:rPr>
+          <w:lang w:val="en_US" w:bidi="en_US"/>
+        </w:rPr>
+      </w:r>
+    </w:p>
+    <w:p>
+      <w:pPr/>
+      <w:r>
+        <w:rPr>
+          <w:lang w:val="en_US" w:bidi="en_US"/>
+        </w:rPr>
+      </w:r>
+    </w:p>
+    <w:p>
+      <w:pPr>
+        <w:pStyle w:val="Heading2"/>
+      </w:pPr>
+      <w:r>
+        <w:rPr>
+          <w:lang w:val="en_US" w:bidi="en_US"/>
+        </w:rPr>
+        <w:t>veil, veiled, unveiled</w:t>
+      </w:r>
+      <w:r>
+        <w:rPr>
+          <w:lang w:val="en_US" w:bidi="en_US"/>
+        </w:rPr>
+      </w:r>
+    </w:p>
+    <w:p>
+      <w:pPr>
+        <w:pStyle w:val="Heading3"/>
+      </w:pPr>
+      <w:r>
+        <w:rPr>
+          <w:lang w:val="en_US" w:bidi="en_US"/>
+        </w:rPr>
+        <w:t>Definition:</w:t>
+      </w:r>
+      <w:r>
+        <w:rPr>
+          <w:lang w:val="en_US" w:bidi="en_US"/>
+        </w:rPr>
+      </w:r>
+    </w:p>
+    <w:p>
+      <w:pPr/>
+      <w:r>
+        <w:rPr>
+          <w:lang w:val="en_US" w:bidi="en_US"/>
+        </w:rPr>
+      </w:r>
+      <w:r>
+        <w:rPr>
+          <w:lang w:val="en_US" w:bidi="en_US"/>
+        </w:rPr>
+        <w:t>The term “veil” usually refers to a thin piece of cloth that is used as a head covering, to fully or partially cover the head or face.</w:t>
+      </w:r>
+      <w:r>
+        <w:rPr>
+          <w:lang w:val="en_US" w:bidi="en_US"/>
+        </w:rPr>
+      </w:r>
+      <w:r>
+        <w:rPr>
+          <w:lang w:val="en_US" w:bidi="en_US"/>
+        </w:rPr>
       </w:r>
     </w:p>
     <w:p>
@@ -704,116 +978,12 @@
         <w:rPr>
           <w:lang w:val="en_US" w:bidi="en_US"/>
         </w:rPr>
-        <w:t>In some contexts, the term “unleavened bread” refers to the “Feast of Unleavened Bread” and can be translated that way.</w:t>
-      </w:r>
-    </w:p>
-    <w:p>
-      <w:pPr/>
-      <w:r>
-        <w:rPr>
-          <w:lang w:val="en_US" w:bidi="en_US"/>
-        </w:rPr>
-      </w:r>
-      <w:r>
-        <w:rPr>
-          <w:lang w:val="en_US" w:bidi="en_US"/>
-        </w:rPr>
-        <w:t xml:space="preserve">(See also: </w:t>
-      </w:r>
-      <w:r>
-        <w:rPr>
-          <w:lang w:val="en_US" w:bidi="en_US"/>
-        </w:rPr>
-        <w:t>bread</w:t>
-      </w:r>
-      <w:r>
-        <w:rPr>
-          <w:lang w:val="en_US" w:bidi="en_US"/>
-        </w:rPr>
-        <w:t xml:space="preserve">, </w:t>
-      </w:r>
-      <w:r>
-        <w:rPr>
-          <w:lang w:val="en_US" w:bidi="en_US"/>
-        </w:rPr>
-        <w:t>Egypt</w:t>
-      </w:r>
-      <w:r>
-        <w:rPr>
-          <w:lang w:val="en_US" w:bidi="en_US"/>
-        </w:rPr>
-        <w:t xml:space="preserve">, </w:t>
-      </w:r>
-      <w:r>
-        <w:rPr>
-          <w:lang w:val="en_US" w:bidi="en_US"/>
-        </w:rPr>
-        <w:t>feast</w:t>
-      </w:r>
-      <w:r>
-        <w:rPr>
-          <w:lang w:val="en_US" w:bidi="en_US"/>
-        </w:rPr>
-        <w:t xml:space="preserve">, </w:t>
-      </w:r>
-      <w:r>
-        <w:rPr>
-          <w:lang w:val="en_US" w:bidi="en_US"/>
-        </w:rPr>
-        <w:t>Passover</w:t>
-      </w:r>
-      <w:r>
-        <w:rPr>
-          <w:lang w:val="en_US" w:bidi="en_US"/>
-        </w:rPr>
-        <w:t xml:space="preserve">, </w:t>
-      </w:r>
-      <w:r>
-        <w:rPr>
-          <w:lang w:val="en_US" w:bidi="en_US"/>
-        </w:rPr>
-        <w:t>servant</w:t>
-      </w:r>
-      <w:r>
-        <w:rPr>
-          <w:lang w:val="en_US" w:bidi="en_US"/>
-        </w:rPr>
-        <w:t xml:space="preserve">, </w:t>
-      </w:r>
-      <w:r>
-        <w:rPr>
-          <w:lang w:val="en_US" w:bidi="en_US"/>
-        </w:rPr>
-        <w:t>sin</w:t>
-      </w:r>
-      <w:r>
-        <w:rPr>
-          <w:lang w:val="en_US" w:bidi="en_US"/>
-        </w:rPr>
-        <w:t xml:space="preserve">, </w:t>
-      </w:r>
-      <w:r>
-        <w:rPr>
-          <w:lang w:val="en_US" w:bidi="en_US"/>
-        </w:rPr>
-        <w:t>yeast</w:t>
-      </w:r>
-      <w:r>
-        <w:rPr>
-          <w:lang w:val="en_US" w:bidi="en_US"/>
-        </w:rPr>
-        <w:t>)</w:t>
-      </w:r>
-    </w:p>
-    <w:p>
-      <w:pPr>
-        <w:pStyle w:val="Heading3"/>
-      </w:pPr>
-      <w:r>
-        <w:rPr>
-          <w:lang w:val="en_US" w:bidi="en_US"/>
-        </w:rPr>
-        <w:t>Bible References:</w:t>
+        <w:t>Moses covered his face with a veil after he had been in the presence of Yahweh, so that the brightness of his face would be hidden from the people.</w:t>
+      </w:r>
+      <w:r>
+        <w:rPr>
+          <w:lang w:val="en_US" w:bidi="en_US"/>
+        </w:rPr>
       </w:r>
     </w:p>
     <w:p>
@@ -827,18 +997,17 @@
           <w:lang w:val="en_US" w:bidi="en_US"/>
         </w:rPr>
       </w:r>
-      <w:hyperlink r:id="rId19">
-        <w:r>
-          <w:rPr>
-            <w:lang w:val="en_US" w:bidi="en_US"/>
-          </w:rPr>
-          <w:rPr>
-            <w:color w:val="0000EE"/>
-            <w:u w:val="single"/>
-          </w:rPr>
-          <w:t>1 Corinthians 5:6–8</w:t>
-        </w:r>
-      </w:hyperlink>
+      <w:r>
+        <w:rPr>
+          <w:lang w:val="en_US" w:bidi="en_US"/>
+        </w:rPr>
+        <w:t>In the Bible, women wore a veil to cover their head, and often their face as well, when they were in public or in the presence of men.</w:t>
+      </w:r>
+      <w:r>
+        <w:rPr>
+          <w:lang w:val="en_US" w:bidi="en_US"/>
+        </w:rPr>
+      </w:r>
     </w:p>
     <w:p>
       <w:pPr>
@@ -851,18 +1020,17 @@
           <w:lang w:val="en_US" w:bidi="en_US"/>
         </w:rPr>
       </w:r>
-      <w:hyperlink r:id="rId20">
-        <w:r>
-          <w:rPr>
-            <w:lang w:val="en_US" w:bidi="en_US"/>
-          </w:rPr>
-          <w:rPr>
-            <w:color w:val="0000EE"/>
-            <w:u w:val="single"/>
-          </w:rPr>
-          <w:t>2 Chronicles 30:13–15</w:t>
-        </w:r>
-      </w:hyperlink>
+      <w:r>
+        <w:rPr>
+          <w:lang w:val="en_US" w:bidi="en_US"/>
+        </w:rPr>
+        <w:t>The veils that women in the Bible wore over their face may have been made of thin material which could be partly seen through and may have only covered part of the face so that the women’s eyes were not covered.</w:t>
+      </w:r>
+      <w:r>
+        <w:rPr>
+          <w:lang w:val="en_US" w:bidi="en_US"/>
+        </w:rPr>
+      </w:r>
     </w:p>
     <w:p>
       <w:pPr>
@@ -875,18 +1043,17 @@
           <w:lang w:val="en_US" w:bidi="en_US"/>
         </w:rPr>
       </w:r>
-      <w:hyperlink r:id="rId21">
-        <w:r>
-          <w:rPr>
-            <w:lang w:val="en_US" w:bidi="en_US"/>
-          </w:rPr>
-          <w:rPr>
-            <w:color w:val="0000EE"/>
-            <w:u w:val="single"/>
-          </w:rPr>
-          <w:t>Acts 12:3</w:t>
-        </w:r>
-      </w:hyperlink>
+      <w:r>
+        <w:rPr>
+          <w:lang w:val="en_US" w:bidi="en_US"/>
+        </w:rPr>
+        <w:t>The verb to “veil” means to cover something with a veil.</w:t>
+      </w:r>
+      <w:r>
+        <w:rPr>
+          <w:lang w:val="en_US" w:bidi="en_US"/>
+        </w:rPr>
+      </w:r>
     </w:p>
     <w:p>
       <w:pPr>
@@ -899,18 +1066,43 @@
           <w:lang w:val="en_US" w:bidi="en_US"/>
         </w:rPr>
       </w:r>
-      <w:hyperlink r:id="rId22">
-        <w:r>
-          <w:rPr>
-            <w:lang w:val="en_US" w:bidi="en_US"/>
-          </w:rPr>
-          <w:rPr>
-            <w:color w:val="0000EE"/>
-            <w:u w:val="single"/>
-          </w:rPr>
-          <w:t>Exodus 23:14–15</w:t>
-        </w:r>
-      </w:hyperlink>
+      <w:r>
+        <w:rPr>
+          <w:lang w:val="en_US" w:bidi="en_US"/>
+        </w:rPr>
+        <w:t>In some English versions, the word “veil” is used to refer to the thick curtain that covered the entrance into the most holy place. But “curtain” is a better term in that context, since it refers to a heavy, thick piece of cloth.</w:t>
+      </w:r>
+      <w:r>
+        <w:rPr>
+          <w:lang w:val="en_US" w:bidi="en_US"/>
+        </w:rPr>
+      </w:r>
+      <w:r>
+        <w:rPr>
+          <w:lang w:val="en_US" w:bidi="en_US"/>
+        </w:rPr>
+      </w:r>
+    </w:p>
+    <w:p>
+      <w:pPr>
+        <w:pStyle w:val="Heading3"/>
+      </w:pPr>
+      <w:r>
+        <w:rPr>
+          <w:lang w:val="en_US" w:bidi="en_US"/>
+        </w:rPr>
+        <w:t>Translation Suggestions</w:t>
+      </w:r>
+      <w:r>
+        <w:rPr>
+          <w:lang w:val="en_US" w:bidi="en_US"/>
+        </w:rPr>
+      </w:r>
+      <w:r>
+        <w:rPr>
+          <w:lang w:val="en_US" w:bidi="en_US"/>
+        </w:rPr>
+      </w:r>
     </w:p>
     <w:p>
       <w:pPr>
@@ -923,18 +1115,17 @@
           <w:lang w:val="en_US" w:bidi="en_US"/>
         </w:rPr>
       </w:r>
-      <w:hyperlink r:id="rId23">
-        <w:r>
-          <w:rPr>
-            <w:lang w:val="en_US" w:bidi="en_US"/>
-          </w:rPr>
-          <w:rPr>
-            <w:color w:val="0000EE"/>
-            <w:u w:val="single"/>
-          </w:rPr>
-          <w:t>Ezra 6:21–22</w:t>
-        </w:r>
-      </w:hyperlink>
+      <w:r>
+        <w:rPr>
+          <w:lang w:val="en_US" w:bidi="en_US"/>
+        </w:rPr>
+        <w:t>The term “veil” could also be translated as “thin cloth covering” or “cloth covering” or “head covering” or “head covering.”</w:t>
+      </w:r>
+      <w:r>
+        <w:rPr>
+          <w:lang w:val="en_US" w:bidi="en_US"/>
+        </w:rPr>
+      </w:r>
     </w:p>
     <w:p>
       <w:pPr>
@@ -947,18 +1138,74 @@
           <w:lang w:val="en_US" w:bidi="en_US"/>
         </w:rPr>
       </w:r>
-      <w:hyperlink r:id="rId24">
-        <w:r>
-          <w:rPr>
-            <w:lang w:val="en_US" w:bidi="en_US"/>
-          </w:rPr>
-          <w:rPr>
-            <w:color w:val="0000EE"/>
-            <w:u w:val="single"/>
-          </w:rPr>
-          <w:t>Genesis 19:1–3</w:t>
-        </w:r>
-      </w:hyperlink>
+      <w:r>
+        <w:rPr>
+          <w:lang w:val="en_US" w:bidi="en_US"/>
+        </w:rPr>
+        <w:t>In some cultures, there may already be a term for a veil for women. It may be necessary to find a different word when it is used for Moses.</w:t>
+      </w:r>
+      <w:r>
+        <w:rPr>
+          <w:lang w:val="en_US" w:bidi="en_US"/>
+        </w:rPr>
+      </w:r>
+      <w:r>
+        <w:rPr>
+          <w:lang w:val="en_US" w:bidi="en_US"/>
+        </w:rPr>
+      </w:r>
+    </w:p>
+    <w:p>
+      <w:pPr/>
+      <w:r>
+        <w:rPr>
+          <w:lang w:val="en_US" w:bidi="en_US"/>
+        </w:rPr>
+      </w:r>
+      <w:r>
+        <w:rPr>
+          <w:lang w:val="en_US" w:bidi="en_US"/>
+        </w:rPr>
+        <w:t xml:space="preserve">(See also: </w:t>
+      </w:r>
+      <w:r>
+        <w:rPr>
+          <w:lang w:val="en_US" w:bidi="en_US"/>
+        </w:rPr>
+        <w:t>Moses</w:t>
+      </w:r>
+      <w:r>
+        <w:rPr>
+          <w:lang w:val="en_US" w:bidi="en_US"/>
+        </w:rPr>
+        <w:t>)</w:t>
+      </w:r>
+      <w:r>
+        <w:rPr>
+          <w:lang w:val="en_US" w:bidi="en_US"/>
+        </w:rPr>
+      </w:r>
+    </w:p>
+    <w:p>
+      <w:pPr>
+        <w:pStyle w:val="Heading3"/>
+      </w:pPr>
+      <w:r>
+        <w:rPr>
+          <w:lang w:val="en_US" w:bidi="en_US"/>
+        </w:rPr>
+        <w:t>Bible References:</w:t>
+      </w:r>
+      <w:r>
+        <w:rPr>
+          <w:lang w:val="en_US" w:bidi="en_US"/>
+        </w:rPr>
+      </w:r>
+      <w:r>
+        <w:rPr>
+          <w:lang w:val="en_US" w:bidi="en_US"/>
+        </w:rPr>
+      </w:r>
     </w:p>
     <w:p>
       <w:pPr>
@@ -971,18 +1218,17 @@
           <w:lang w:val="en_US" w:bidi="en_US"/>
         </w:rPr>
       </w:r>
-      <w:hyperlink r:id="rId25">
-        <w:r>
-          <w:rPr>
-            <w:lang w:val="en_US" w:bidi="en_US"/>
-          </w:rPr>
-          <w:rPr>
-            <w:color w:val="0000EE"/>
-            <w:u w:val="single"/>
-          </w:rPr>
-          <w:t>Judges 6:21</w:t>
-        </w:r>
-      </w:hyperlink>
+      <w:r>
+        <w:rPr>
+          <w:lang w:val="en_US" w:bidi="en_US"/>
+        </w:rPr>
+        <w:t>2 Corinthians 3:12–13</w:t>
+      </w:r>
+      <w:r>
+        <w:rPr>
+          <w:lang w:val="en_US" w:bidi="en_US"/>
+        </w:rPr>
+      </w:r>
     </w:p>
     <w:p>
       <w:pPr>
@@ -995,18 +1241,17 @@
           <w:lang w:val="en_US" w:bidi="en_US"/>
         </w:rPr>
       </w:r>
-      <w:hyperlink r:id="rId26">
-        <w:r>
-          <w:rPr>
-            <w:lang w:val="en_US" w:bidi="en_US"/>
-          </w:rPr>
-          <w:rPr>
-            <w:color w:val="0000EE"/>
-            <w:u w:val="single"/>
-          </w:rPr>
-          <w:t>Leviticus 8:1–3</w:t>
-        </w:r>
-      </w:hyperlink>
+      <w:r>
+        <w:rPr>
+          <w:lang w:val="en_US" w:bidi="en_US"/>
+        </w:rPr>
+        <w:t>2 Corinthians 3:16</w:t>
+      </w:r>
+      <w:r>
+        <w:rPr>
+          <w:lang w:val="en_US" w:bidi="en_US"/>
+        </w:rPr>
+      </w:r>
     </w:p>
     <w:p>
       <w:pPr>
@@ -1019,28 +1264,16 @@
           <w:lang w:val="en_US" w:bidi="en_US"/>
         </w:rPr>
       </w:r>
-      <w:hyperlink r:id="rId27">
-        <w:r>
-          <w:rPr>
-            <w:lang w:val="en_US" w:bidi="en_US"/>
-          </w:rPr>
-          <w:rPr>
-            <w:color w:val="0000EE"/>
-            <w:u w:val="single"/>
-          </w:rPr>
-          <w:t>Luke 22:1</w:t>
-        </w:r>
-      </w:hyperlink>
-    </w:p>
-    <w:p>
-      <w:pPr>
-        <w:pStyle w:val="Heading3"/>
-      </w:pPr>
-      <w:r>
-        <w:rPr>
-          <w:lang w:val="en_US" w:bidi="en_US"/>
-        </w:rPr>
-        <w:t>Word Data:</w:t>
+      <w:r>
+        <w:rPr>
+          <w:lang w:val="en_US" w:bidi="en_US"/>
+        </w:rPr>
+        <w:t>Ezekiel 13:18</w:t>
+      </w:r>
+      <w:r>
+        <w:rPr>
+          <w:lang w:val="en_US" w:bidi="en_US"/>
+        </w:rPr>
       </w:r>
     </w:p>
     <w:p>
@@ -1058,66 +1291,12 @@
         <w:rPr>
           <w:lang w:val="en_US" w:bidi="en_US"/>
         </w:rPr>
-        <w:t>Strong’s: H4682, G01060</w:t>
-      </w:r>
-      <w:r>
-        <w:rPr>
-          <w:lang w:val="en_US" w:bidi="en_US"/>
-        </w:rPr>
-      </w:r>
-      <w:r>
-        <w:rPr>
-          <w:lang w:val="en_US" w:bidi="en_US"/>
-        </w:rPr>
-      </w:r>
-    </w:p>
-    <w:p>
-      <w:pPr/>
-      <w:r>
-        <w:rPr>
-          <w:lang w:val="en_US" w:bidi="en_US"/>
-        </w:rPr>
-      </w:r>
-    </w:p>
-    <w:p>
-      <w:pPr>
-        <w:pStyle w:val="Heading2"/>
-      </w:pPr>
-      <w:r>
-        <w:rPr>
-          <w:lang w:val="en_US" w:bidi="en_US"/>
-        </w:rPr>
-        <w:t>Ur</w:t>
-      </w:r>
-      <w:r>
-        <w:rPr>
-          <w:lang w:val="en_US" w:bidi="en_US"/>
-        </w:rPr>
-      </w:r>
-    </w:p>
-    <w:p>
-      <w:pPr>
-        <w:pStyle w:val="Heading3"/>
-      </w:pPr>
-      <w:r>
-        <w:rPr>
-          <w:lang w:val="en_US" w:bidi="en_US"/>
-        </w:rPr>
-        <w:t>Facts:</w:t>
-      </w:r>
-    </w:p>
-    <w:p>
-      <w:pPr/>
-      <w:r>
-        <w:rPr>
-          <w:lang w:val="en_US" w:bidi="en_US"/>
-        </w:rPr>
-      </w:r>
-      <w:r>
-        <w:rPr>
-          <w:lang w:val="en_US" w:bidi="en_US"/>
-        </w:rPr>
-        <w:t>Ur was an important city along the Euphrates River in the ancient region of Chaldea, which was part of Mesopotamia. This region was located in what is now the modern-day country of Iraq.</w:t>
+        <w:t>Isaiah 47:1–2</w:t>
+      </w:r>
+      <w:r>
+        <w:rPr>
+          <w:lang w:val="en_US" w:bidi="en_US"/>
+        </w:rPr>
       </w:r>
     </w:p>
     <w:p>
@@ -1135,7 +1314,38 @@
         <w:rPr>
           <w:lang w:val="en_US" w:bidi="en_US"/>
         </w:rPr>
-        <w:t>Abraham was from the city of Ur and it was from there that God called him to leave to go to the land of Canaan.</w:t>
+        <w:t>Song of Songs 4:3</w:t>
+      </w:r>
+      <w:r>
+        <w:rPr>
+          <w:lang w:val="en_US" w:bidi="en_US"/>
+        </w:rPr>
+      </w:r>
+      <w:r>
+        <w:rPr>
+          <w:lang w:val="en_US" w:bidi="en_US"/>
+        </w:rPr>
+      </w:r>
+    </w:p>
+    <w:p>
+      <w:pPr>
+        <w:pStyle w:val="Heading3"/>
+      </w:pPr>
+      <w:r>
+        <w:rPr>
+          <w:lang w:val="en_US" w:bidi="en_US"/>
+        </w:rPr>
+        <w:t>Word Data:</w:t>
+      </w:r>
+      <w:r>
+        <w:rPr>
+          <w:lang w:val="en_US" w:bidi="en_US"/>
+        </w:rPr>
+      </w:r>
+      <w:r>
+        <w:rPr>
+          <w:lang w:val="en_US" w:bidi="en_US"/>
+        </w:rPr>
       </w:r>
     </w:p>
     <w:p>
@@ -1153,7 +1363,22 @@
         <w:rPr>
           <w:lang w:val="en_US" w:bidi="en_US"/>
         </w:rPr>
-        <w:t>Haran, the brother of Abraham and father of Lot, died in Ur. This was probably a factor that influenced Lot to leave Ur with Abraham.</w:t>
+        <w:t>Strong’s: H4304, H4533, H4555, H6777, H6809, H7196, H7479, G03430, G25710, G25720</w:t>
+      </w:r>
+      <w:r>
+        <w:rPr>
+          <w:lang w:val="en_US" w:bidi="en_US"/>
+        </w:rPr>
+      </w:r>
+      <w:r>
+        <w:rPr>
+          <w:lang w:val="en_US" w:bidi="en_US"/>
+        </w:rPr>
+      </w:r>
+      <w:r>
+        <w:rPr>
+          <w:lang w:val="en_US" w:bidi="en_US"/>
+        </w:rPr>
       </w:r>
     </w:p>
     <w:p>
@@ -1163,11 +1388,37 @@
           <w:lang w:val="en_US" w:bidi="en_US"/>
         </w:rPr>
       </w:r>
-      <w:r>
-        <w:rPr>
-          <w:lang w:val="en_US" w:bidi="en_US"/>
-        </w:rPr>
-        <w:t>(Translation suggestions: How to Translate Names)</w:t>
+    </w:p>
+    <w:p>
+      <w:pPr>
+        <w:pStyle w:val="Heading2"/>
+      </w:pPr>
+      <w:r>
+        <w:rPr>
+          <w:lang w:val="en_US" w:bidi="en_US"/>
+        </w:rPr>
+        <w:t>vine</w:t>
+      </w:r>
+      <w:r>
+        <w:rPr>
+          <w:lang w:val="en_US" w:bidi="en_US"/>
+        </w:rPr>
+      </w:r>
+    </w:p>
+    <w:p>
+      <w:pPr>
+        <w:pStyle w:val="Heading3"/>
+      </w:pPr>
+      <w:r>
+        <w:rPr>
+          <w:lang w:val="en_US" w:bidi="en_US"/>
+        </w:rPr>
+        <w:t>Definition:</w:t>
+      </w:r>
+      <w:r>
+        <w:rPr>
+          <w:lang w:val="en_US" w:bidi="en_US"/>
+        </w:rPr>
       </w:r>
     </w:p>
     <w:p>
@@ -1181,102 +1432,17 @@
         <w:rPr>
           <w:lang w:val="en_US" w:bidi="en_US"/>
         </w:rPr>
-        <w:t xml:space="preserve">(See also: </w:t>
-      </w:r>
-      <w:r>
-        <w:rPr>
-          <w:lang w:val="en_US" w:bidi="en_US"/>
-        </w:rPr>
-        <w:t>Abraham</w:t>
-      </w:r>
-      <w:r>
-        <w:rPr>
-          <w:lang w:val="en_US" w:bidi="en_US"/>
-        </w:rPr>
-        <w:t xml:space="preserve">, </w:t>
-      </w:r>
-      <w:r>
-        <w:rPr>
-          <w:lang w:val="en_US" w:bidi="en_US"/>
-        </w:rPr>
-        <w:t>Canaan</w:t>
-      </w:r>
-      <w:r>
-        <w:rPr>
-          <w:lang w:val="en_US" w:bidi="en_US"/>
-        </w:rPr>
-        <w:t xml:space="preserve">, </w:t>
-      </w:r>
-      <w:r>
-        <w:rPr>
-          <w:lang w:val="en_US" w:bidi="en_US"/>
-        </w:rPr>
-        <w:t>Chaldea</w:t>
-      </w:r>
-      <w:r>
-        <w:rPr>
-          <w:lang w:val="en_US" w:bidi="en_US"/>
-        </w:rPr>
-        <w:t xml:space="preserve">, </w:t>
-      </w:r>
-      <w:r>
-        <w:rPr>
-          <w:lang w:val="en_US" w:bidi="en_US"/>
-        </w:rPr>
-        <w:t>Euphrates River</w:t>
-      </w:r>
-      <w:r>
-        <w:rPr>
-          <w:lang w:val="en_US" w:bidi="en_US"/>
-        </w:rPr>
-        <w:t xml:space="preserve">, </w:t>
-      </w:r>
-      <w:r>
-        <w:rPr>
-          <w:lang w:val="en_US" w:bidi="en_US"/>
-        </w:rPr>
-        <w:t>Haran</w:t>
-      </w:r>
-      <w:r>
-        <w:rPr>
-          <w:lang w:val="en_US" w:bidi="en_US"/>
-        </w:rPr>
-        <w:t xml:space="preserve">, </w:t>
-      </w:r>
-      <w:r>
-        <w:rPr>
-          <w:lang w:val="en_US" w:bidi="en_US"/>
-        </w:rPr>
-        <w:t>Lot</w:t>
-      </w:r>
-      <w:r>
-        <w:rPr>
-          <w:lang w:val="en_US" w:bidi="en_US"/>
-        </w:rPr>
-        <w:t xml:space="preserve">, </w:t>
-      </w:r>
-      <w:r>
-        <w:rPr>
-          <w:lang w:val="en_US" w:bidi="en_US"/>
-        </w:rPr>
-        <w:t>Mesopotamia</w:t>
-      </w:r>
-      <w:r>
-        <w:rPr>
-          <w:lang w:val="en_US" w:bidi="en_US"/>
-        </w:rPr>
-        <w:t>)</w:t>
-      </w:r>
-    </w:p>
-    <w:p>
-      <w:pPr>
-        <w:pStyle w:val="Heading3"/>
-      </w:pPr>
-      <w:r>
-        <w:rPr>
-          <w:lang w:val="en_US" w:bidi="en_US"/>
-        </w:rPr>
-        <w:t>Bible References:</w:t>
+        <w:t>The term “vine” refers to a plant that grows by trailing along the ground or by climbing trees and other structures. The word “vine” in the Bible is used only of fruit-bearing vines and usually refers to grape vines.</w:t>
+      </w:r>
+      <w:r>
+        <w:rPr>
+          <w:lang w:val="en_US" w:bidi="en_US"/>
+        </w:rPr>
+      </w:r>
+      <w:r>
+        <w:rPr>
+          <w:lang w:val="en_US" w:bidi="en_US"/>
+        </w:rPr>
       </w:r>
     </w:p>
     <w:p>
@@ -1290,18 +1456,17 @@
           <w:lang w:val="en_US" w:bidi="en_US"/>
         </w:rPr>
       </w:r>
-      <w:hyperlink r:id="rId28">
-        <w:r>
-          <w:rPr>
-            <w:lang w:val="en_US" w:bidi="en_US"/>
-          </w:rPr>
-          <w:rPr>
-            <w:color w:val="0000EE"/>
-            <w:u w:val="single"/>
-          </w:rPr>
-          <w:t>Genesis 11:27–28</w:t>
-        </w:r>
-      </w:hyperlink>
+      <w:r>
+        <w:rPr>
+          <w:lang w:val="en_US" w:bidi="en_US"/>
+        </w:rPr>
+        <w:t>In the Bible, the word “vine” almost always means “grapevine.”</w:t>
+      </w:r>
+      <w:r>
+        <w:rPr>
+          <w:lang w:val="en_US" w:bidi="en_US"/>
+        </w:rPr>
+      </w:r>
     </w:p>
     <w:p>
       <w:pPr>
@@ -1314,28 +1479,16 @@
           <w:lang w:val="en_US" w:bidi="en_US"/>
         </w:rPr>
       </w:r>
-      <w:hyperlink r:id="rId29">
-        <w:r>
-          <w:rPr>
-            <w:lang w:val="en_US" w:bidi="en_US"/>
-          </w:rPr>
-          <w:rPr>
-            <w:color w:val="0000EE"/>
-            <w:u w:val="single"/>
-          </w:rPr>
-          <w:t>Genesis 11:31</w:t>
-        </w:r>
-      </w:hyperlink>
-    </w:p>
-    <w:p>
-      <w:pPr>
-        <w:pStyle w:val="Heading3"/>
-      </w:pPr>
-      <w:r>
-        <w:rPr>
-          <w:lang w:val="en_US" w:bidi="en_US"/>
-        </w:rPr>
-        <w:t>Word Data:</w:t>
+      <w:r>
+        <w:rPr>
+          <w:lang w:val="en_US" w:bidi="en_US"/>
+        </w:rPr>
+        <w:t>The branches of the grapevine are attached to the main stem which gives them water and other nutrients so that they can grow.</w:t>
+      </w:r>
+      <w:r>
+        <w:rPr>
+          <w:lang w:val="en_US" w:bidi="en_US"/>
+        </w:rPr>
       </w:r>
     </w:p>
     <w:p>
@@ -1353,7 +1506,7 @@
         <w:rPr>
           <w:lang w:val="en_US" w:bidi="en_US"/>
         </w:rPr>
-        <w:t>Strong’s: H0218</w:t>
+        <w:t>Jesus called himself the “vine” and called his people the “branches.” In this context, the word “vine” could also be translated as “grapevine stem” or “grape plant stem.” (See: Metaphor)</w:t>
       </w:r>
       <w:r>
         <w:rPr>
@@ -1373,16 +1526,35 @@
           <w:lang w:val="en_US" w:bidi="en_US"/>
         </w:rPr>
       </w:r>
-    </w:p>
-    <w:p>
-      <w:pPr>
-        <w:pStyle w:val="Heading2"/>
-      </w:pPr>
-      <w:r>
-        <w:rPr>
-          <w:lang w:val="en_US" w:bidi="en_US"/>
-        </w:rPr>
-        <w:t>Uriah</w:t>
+      <w:r>
+        <w:rPr>
+          <w:lang w:val="en_US" w:bidi="en_US"/>
+        </w:rPr>
+        <w:t xml:space="preserve">(See also: </w:t>
+      </w:r>
+      <w:r>
+        <w:rPr>
+          <w:lang w:val="en_US" w:bidi="en_US"/>
+        </w:rPr>
+        <w:t>grape</w:t>
+      </w:r>
+      <w:r>
+        <w:rPr>
+          <w:lang w:val="en_US" w:bidi="en_US"/>
+        </w:rPr>
+        <w:t xml:space="preserve">, </w:t>
+      </w:r>
+      <w:r>
+        <w:rPr>
+          <w:lang w:val="en_US" w:bidi="en_US"/>
+        </w:rPr>
+        <w:t>vineyard</w:t>
+      </w:r>
+      <w:r>
+        <w:rPr>
+          <w:lang w:val="en_US" w:bidi="en_US"/>
+        </w:rPr>
+        <w:t>)</w:t>
       </w:r>
       <w:r>
         <w:rPr>
@@ -1398,21 +1570,17 @@
         <w:rPr>
           <w:lang w:val="en_US" w:bidi="en_US"/>
         </w:rPr>
-        <w:t>Facts:</w:t>
-      </w:r>
-    </w:p>
-    <w:p>
-      <w:pPr/>
-      <w:r>
-        <w:rPr>
-          <w:lang w:val="en_US" w:bidi="en_US"/>
-        </w:rPr>
-      </w:r>
-      <w:r>
-        <w:rPr>
-          <w:lang w:val="en_US" w:bidi="en_US"/>
-        </w:rPr>
-        <w:t>Uriah was a righteous man and one of King David’s best soldiers. He is often referred to as “Uriah the Hittite.”</w:t>
+        <w:t>Bible References:</w:t>
+      </w:r>
+      <w:r>
+        <w:rPr>
+          <w:lang w:val="en_US" w:bidi="en_US"/>
+        </w:rPr>
+      </w:r>
+      <w:r>
+        <w:rPr>
+          <w:lang w:val="en_US" w:bidi="en_US"/>
+        </w:rPr>
       </w:r>
     </w:p>
     <w:p>
@@ -1430,7 +1598,12 @@
         <w:rPr>
           <w:lang w:val="en_US" w:bidi="en_US"/>
         </w:rPr>
-        <w:t>Uriah had a very beautiful wife named Bathsheba.</w:t>
+        <w:t>Genesis 40:9</w:t>
+      </w:r>
+      <w:r>
+        <w:rPr>
+          <w:lang w:val="en_US" w:bidi="en_US"/>
+        </w:rPr>
       </w:r>
     </w:p>
     <w:p>
@@ -1448,7 +1621,12 @@
         <w:rPr>
           <w:lang w:val="en_US" w:bidi="en_US"/>
         </w:rPr>
-        <w:t>David committed adultery with Uriah’s wife, and she became pregnant with David’s child.</w:t>
+        <w:t>Genesis 49:11</w:t>
+      </w:r>
+      <w:r>
+        <w:rPr>
+          <w:lang w:val="en_US" w:bidi="en_US"/>
+        </w:rPr>
       </w:r>
     </w:p>
     <w:p>
@@ -1466,7 +1644,12 @@
         <w:rPr>
           <w:lang w:val="en_US" w:bidi="en_US"/>
         </w:rPr>
-        <w:t>To cover up this sin, David caused Uriah to be killed in battle. Then David married Bathsheba.</w:t>
+        <w:t>John 15:1</w:t>
+      </w:r>
+      <w:r>
+        <w:rPr>
+          <w:lang w:val="en_US" w:bidi="en_US"/>
+        </w:rPr>
       </w:r>
     </w:p>
     <w:p>
@@ -1484,94 +1667,12 @@
         <w:rPr>
           <w:lang w:val="en_US" w:bidi="en_US"/>
         </w:rPr>
-        <w:t>Another man named Uriah was a priest during the time of King Ahaz.</w:t>
-      </w:r>
-    </w:p>
-    <w:p>
-      <w:pPr/>
-      <w:r>
-        <w:rPr>
-          <w:lang w:val="en_US" w:bidi="en_US"/>
-        </w:rPr>
-      </w:r>
-      <w:r>
-        <w:rPr>
-          <w:lang w:val="en_US" w:bidi="en_US"/>
-        </w:rPr>
-        <w:t>(Translation suggestions: How to Translate Names)</w:t>
-      </w:r>
-    </w:p>
-    <w:p>
-      <w:pPr/>
-      <w:r>
-        <w:rPr>
-          <w:lang w:val="en_US" w:bidi="en_US"/>
-        </w:rPr>
-      </w:r>
-      <w:r>
-        <w:rPr>
-          <w:lang w:val="en_US" w:bidi="en_US"/>
-        </w:rPr>
-        <w:t xml:space="preserve">(See also: </w:t>
-      </w:r>
-      <w:r>
-        <w:rPr>
-          <w:lang w:val="en_US" w:bidi="en_US"/>
-        </w:rPr>
-        <w:t>Ahaz</w:t>
-      </w:r>
-      <w:r>
-        <w:rPr>
-          <w:lang w:val="en_US" w:bidi="en_US"/>
-        </w:rPr>
-        <w:t xml:space="preserve">, </w:t>
-      </w:r>
-      <w:r>
-        <w:rPr>
-          <w:lang w:val="en_US" w:bidi="en_US"/>
-        </w:rPr>
-        <w:t>Bathsheba</w:t>
-      </w:r>
-      <w:r>
-        <w:rPr>
-          <w:lang w:val="en_US" w:bidi="en_US"/>
-        </w:rPr>
-        <w:t xml:space="preserve">, </w:t>
-      </w:r>
-      <w:r>
-        <w:rPr>
-          <w:lang w:val="en_US" w:bidi="en_US"/>
-        </w:rPr>
-        <w:t>David</w:t>
-      </w:r>
-      <w:r>
-        <w:rPr>
-          <w:lang w:val="en_US" w:bidi="en_US"/>
-        </w:rPr>
-        <w:t xml:space="preserve">, </w:t>
-      </w:r>
-      <w:r>
-        <w:rPr>
-          <w:lang w:val="en_US" w:bidi="en_US"/>
-        </w:rPr>
-        <w:t>Hittite</w:t>
-      </w:r>
-      <w:r>
-        <w:rPr>
-          <w:lang w:val="en_US" w:bidi="en_US"/>
-        </w:rPr>
-        <w:t>)</w:t>
-      </w:r>
-    </w:p>
-    <w:p>
-      <w:pPr>
-        <w:pStyle w:val="Heading3"/>
-      </w:pPr>
-      <w:r>
-        <w:rPr>
-          <w:lang w:val="en_US" w:bidi="en_US"/>
-        </w:rPr>
-        <w:t>Bible References:</w:t>
+        <w:t>Luke 22:18</w:t>
+      </w:r>
+      <w:r>
+        <w:rPr>
+          <w:lang w:val="en_US" w:bidi="en_US"/>
+        </w:rPr>
       </w:r>
     </w:p>
     <w:p>
@@ -1585,18 +1686,17 @@
           <w:lang w:val="en_US" w:bidi="en_US"/>
         </w:rPr>
       </w:r>
-      <w:hyperlink r:id="rId30">
-        <w:r>
-          <w:rPr>
-            <w:lang w:val="en_US" w:bidi="en_US"/>
-          </w:rPr>
-          <w:rPr>
-            <w:color w:val="0000EE"/>
-            <w:u w:val="single"/>
-          </w:rPr>
-          <w:t>1 Kings 15:5</w:t>
-        </w:r>
-      </w:hyperlink>
+      <w:r>
+        <w:rPr>
+          <w:lang w:val="en_US" w:bidi="en_US"/>
+        </w:rPr>
+        <w:t>Mark 12:3</w:t>
+      </w:r>
+      <w:r>
+        <w:rPr>
+          <w:lang w:val="en_US" w:bidi="en_US"/>
+        </w:rPr>
+      </w:r>
     </w:p>
     <w:p>
       <w:pPr>
@@ -1609,18 +1709,43 @@
           <w:lang w:val="en_US" w:bidi="en_US"/>
         </w:rPr>
       </w:r>
-      <w:hyperlink r:id="rId31">
-        <w:r>
-          <w:rPr>
-            <w:lang w:val="en_US" w:bidi="en_US"/>
-          </w:rPr>
-          <w:rPr>
-            <w:color w:val="0000EE"/>
-            <w:u w:val="single"/>
-          </w:rPr>
-          <w:t>2 Samuel 11:3</w:t>
-        </w:r>
-      </w:hyperlink>
+      <w:r>
+        <w:rPr>
+          <w:lang w:val="en_US" w:bidi="en_US"/>
+        </w:rPr>
+        <w:t>Matthew 21:35–37</w:t>
+      </w:r>
+      <w:r>
+        <w:rPr>
+          <w:lang w:val="en_US" w:bidi="en_US"/>
+        </w:rPr>
+      </w:r>
+      <w:r>
+        <w:rPr>
+          <w:lang w:val="en_US" w:bidi="en_US"/>
+        </w:rPr>
+      </w:r>
+    </w:p>
+    <w:p>
+      <w:pPr>
+        <w:pStyle w:val="Heading3"/>
+      </w:pPr>
+      <w:r>
+        <w:rPr>
+          <w:lang w:val="en_US" w:bidi="en_US"/>
+        </w:rPr>
+        <w:t>Word Data:</w:t>
+      </w:r>
+      <w:r>
+        <w:rPr>
+          <w:lang w:val="en_US" w:bidi="en_US"/>
+        </w:rPr>
+      </w:r>
+      <w:r>
+        <w:rPr>
+          <w:lang w:val="en_US" w:bidi="en_US"/>
+        </w:rPr>
+      </w:r>
     </w:p>
     <w:p>
       <w:pPr>
@@ -1633,18 +1758,91 @@
           <w:lang w:val="en_US" w:bidi="en_US"/>
         </w:rPr>
       </w:r>
-      <w:hyperlink r:id="rId32">
-        <w:r>
-          <w:rPr>
-            <w:lang w:val="en_US" w:bidi="en_US"/>
-          </w:rPr>
-          <w:rPr>
-            <w:color w:val="0000EE"/>
-            <w:u w:val="single"/>
-          </w:rPr>
-          <w:t>2 Samuel 11:26–27</w:t>
-        </w:r>
-      </w:hyperlink>
+      <w:r>
+        <w:rPr>
+          <w:lang w:val="en_US" w:bidi="en_US"/>
+        </w:rPr>
+        <w:t>Strong’s: H5139, H1612, H8321, G02880, G02900, G10090, G10920</w:t>
+      </w:r>
+      <w:r>
+        <w:rPr>
+          <w:lang w:val="en_US" w:bidi="en_US"/>
+        </w:rPr>
+      </w:r>
+      <w:r>
+        <w:rPr>
+          <w:lang w:val="en_US" w:bidi="en_US"/>
+        </w:rPr>
+      </w:r>
+      <w:r>
+        <w:rPr>
+          <w:lang w:val="en_US" w:bidi="en_US"/>
+        </w:rPr>
+      </w:r>
+    </w:p>
+    <w:p>
+      <w:pPr/>
+      <w:r>
+        <w:rPr>
+          <w:lang w:val="en_US" w:bidi="en_US"/>
+        </w:rPr>
+      </w:r>
+    </w:p>
+    <w:p>
+      <w:pPr>
+        <w:pStyle w:val="Heading2"/>
+      </w:pPr>
+      <w:r>
+        <w:rPr>
+          <w:lang w:val="en_US" w:bidi="en_US"/>
+        </w:rPr>
+        <w:t>vineyard</w:t>
+      </w:r>
+      <w:r>
+        <w:rPr>
+          <w:lang w:val="en_US" w:bidi="en_US"/>
+        </w:rPr>
+      </w:r>
+    </w:p>
+    <w:p>
+      <w:pPr>
+        <w:pStyle w:val="Heading3"/>
+      </w:pPr>
+      <w:r>
+        <w:rPr>
+          <w:lang w:val="en_US" w:bidi="en_US"/>
+        </w:rPr>
+        <w:t>Definition:</w:t>
+      </w:r>
+      <w:r>
+        <w:rPr>
+          <w:lang w:val="en_US" w:bidi="en_US"/>
+        </w:rPr>
+      </w:r>
+    </w:p>
+    <w:p>
+      <w:pPr/>
+      <w:r>
+        <w:rPr>
+          <w:lang w:val="en_US" w:bidi="en_US"/>
+        </w:rPr>
+      </w:r>
+      <w:r>
+        <w:rPr>
+          <w:lang w:val="en_US" w:bidi="en_US"/>
+        </w:rPr>
+        <w:t>A vineyard is a large garden area where grapevines are grown and grapes are cultivated.</w:t>
+      </w:r>
+      <w:r>
+        <w:rPr>
+          <w:lang w:val="en_US" w:bidi="en_US"/>
+        </w:rPr>
+      </w:r>
+      <w:r>
+        <w:rPr>
+          <w:lang w:val="en_US" w:bidi="en_US"/>
+        </w:rPr>
+      </w:r>
     </w:p>
     <w:p>
       <w:pPr>
@@ -1657,28 +1855,16 @@
           <w:lang w:val="en_US" w:bidi="en_US"/>
         </w:rPr>
       </w:r>
-      <w:hyperlink r:id="rId33">
-        <w:r>
-          <w:rPr>
-            <w:lang w:val="en_US" w:bidi="en_US"/>
-          </w:rPr>
-          <w:rPr>
-            <w:color w:val="0000EE"/>
-            <w:u w:val="single"/>
-          </w:rPr>
-          <w:t>Nehemiah 3:4</w:t>
-        </w:r>
-      </w:hyperlink>
-    </w:p>
-    <w:p>
-      <w:pPr>
-        <w:pStyle w:val="Heading3"/>
-      </w:pPr>
-      <w:r>
-        <w:rPr>
-          <w:lang w:val="en_US" w:bidi="en_US"/>
-        </w:rPr>
-        <w:t>Examples from the Bible stories:</w:t>
+      <w:r>
+        <w:rPr>
+          <w:lang w:val="en_US" w:bidi="en_US"/>
+        </w:rPr>
+        <w:t>A vineyard often has a wall around it to protect the fruit from thieves and animals.</w:t>
+      </w:r>
+      <w:r>
+        <w:rPr>
+          <w:lang w:val="en_US" w:bidi="en_US"/>
+        </w:rPr>
       </w:r>
     </w:p>
     <w:p>
@@ -1694,68 +1880,14 @@
       </w:r>
       <w:r>
         <w:rPr>
-          <w:b/>
-          <w:lang w:val="en_US" w:bidi="en_US"/>
-        </w:rPr>
-        <w:t>17:12</w:t>
-      </w:r>
-      <w:r>
-        <w:rPr>
-          <w:lang w:val="en_US" w:bidi="en_US"/>
-        </w:rPr>
-        <w:t xml:space="preserve"> Bathsheba’s husband, a man named </w:t>
-      </w:r>
-      <w:r>
-        <w:rPr>
-          <w:b/>
-          <w:lang w:val="en_US" w:bidi="en_US"/>
-        </w:rPr>
-        <w:t>Uriah</w:t>
-      </w:r>
-      <w:r>
-        <w:rPr>
-          <w:lang w:val="en_US" w:bidi="en_US"/>
-        </w:rPr>
-        <w:t xml:space="preserve">, was one of David’s best soldiers. David called </w:t>
-      </w:r>
-      <w:r>
-        <w:rPr>
-          <w:b/>
-          <w:lang w:val="en_US" w:bidi="en_US"/>
-        </w:rPr>
-        <w:t>Uriah</w:t>
-      </w:r>
-      <w:r>
-        <w:rPr>
-          <w:lang w:val="en_US" w:bidi="en_US"/>
-        </w:rPr>
-        <w:t xml:space="preserve"> back from the battle and told him to go be with his wife. But </w:t>
-      </w:r>
-      <w:r>
-        <w:rPr>
-          <w:b/>
-          <w:lang w:val="en_US" w:bidi="en_US"/>
-        </w:rPr>
-        <w:t>Uriah</w:t>
-      </w:r>
-      <w:r>
-        <w:rPr>
-          <w:lang w:val="en_US" w:bidi="en_US"/>
-        </w:rPr>
-        <w:t xml:space="preserve"> refused to go home while the rest of the soldiers were in battle. So David sent </w:t>
-      </w:r>
-      <w:r>
-        <w:rPr>
-          <w:b/>
-          <w:lang w:val="en_US" w:bidi="en_US"/>
-        </w:rPr>
-        <w:t>Uriah</w:t>
-      </w:r>
-      <w:r>
-        <w:rPr>
-          <w:lang w:val="en_US" w:bidi="en_US"/>
-        </w:rPr>
-        <w:t xml:space="preserve"> back to the battle and told the general to place him where the enemy was strongest so that he would be killed.</w:t>
+          <w:lang w:val="en_US" w:bidi="en_US"/>
+        </w:rPr>
+        <w:t>God compared the people of Israel to a vineyard that did not bear good fruit. (See: Metaphor)</w:t>
+      </w:r>
+      <w:r>
+        <w:rPr>
+          <w:lang w:val="en_US" w:bidi="en_US"/>
+        </w:rPr>
       </w:r>
     </w:p>
     <w:p>
@@ -1771,29 +1903,74 @@
       </w:r>
       <w:r>
         <w:rPr>
-          <w:b/>
-          <w:lang w:val="en_US" w:bidi="en_US"/>
-        </w:rPr>
-        <w:t>17:13</w:t>
-      </w:r>
-      <w:r>
-        <w:rPr>
-          <w:lang w:val="en_US" w:bidi="en_US"/>
-        </w:rPr>
-        <w:t xml:space="preserve"> After </w:t>
-      </w:r>
-      <w:r>
-        <w:rPr>
-          <w:b/>
-          <w:lang w:val="en_US" w:bidi="en_US"/>
-        </w:rPr>
-        <w:t>Uriah</w:t>
-      </w:r>
-      <w:r>
-        <w:rPr>
-          <w:lang w:val="en_US" w:bidi="en_US"/>
-        </w:rPr>
-        <w:t xml:space="preserve"> was killed, David married Bathsheba.</w:t>
+          <w:lang w:val="en_US" w:bidi="en_US"/>
+        </w:rPr>
+        <w:t>Vineyard could be also translated as “grapevine garden” or “grape plantation.”</w:t>
+      </w:r>
+      <w:r>
+        <w:rPr>
+          <w:lang w:val="en_US" w:bidi="en_US"/>
+        </w:rPr>
+      </w:r>
+      <w:r>
+        <w:rPr>
+          <w:lang w:val="en_US" w:bidi="en_US"/>
+        </w:rPr>
+      </w:r>
+    </w:p>
+    <w:p>
+      <w:pPr/>
+      <w:r>
+        <w:rPr>
+          <w:lang w:val="en_US" w:bidi="en_US"/>
+        </w:rPr>
+      </w:r>
+      <w:r>
+        <w:rPr>
+          <w:lang w:val="en_US" w:bidi="en_US"/>
+        </w:rPr>
+        <w:t xml:space="preserve">(See also: </w:t>
+      </w:r>
+      <w:r>
+        <w:rPr>
+          <w:lang w:val="en_US" w:bidi="en_US"/>
+        </w:rPr>
+        <w:t>grape</w:t>
+      </w:r>
+      <w:r>
+        <w:rPr>
+          <w:lang w:val="en_US" w:bidi="en_US"/>
+        </w:rPr>
+        <w:t xml:space="preserve">, </w:t>
+      </w:r>
+      <w:r>
+        <w:rPr>
+          <w:lang w:val="en_US" w:bidi="en_US"/>
+        </w:rPr>
+        <w:t>Israel</w:t>
+      </w:r>
+      <w:r>
+        <w:rPr>
+          <w:lang w:val="en_US" w:bidi="en_US"/>
+        </w:rPr>
+        <w:t xml:space="preserve">, </w:t>
+      </w:r>
+      <w:r>
+        <w:rPr>
+          <w:lang w:val="en_US" w:bidi="en_US"/>
+        </w:rPr>
+        <w:t>vine</w:t>
+      </w:r>
+      <w:r>
+        <w:rPr>
+          <w:lang w:val="en_US" w:bidi="en_US"/>
+        </w:rPr>
+        <w:t>)</w:t>
+      </w:r>
+      <w:r>
+        <w:rPr>
+          <w:lang w:val="en_US" w:bidi="en_US"/>
+        </w:rPr>
       </w:r>
     </w:p>
     <w:p>
@@ -1804,7 +1981,17 @@
         <w:rPr>
           <w:lang w:val="en_US" w:bidi="en_US"/>
         </w:rPr>
-        <w:t>Word Data:</w:t>
+        <w:t>Bible References:</w:t>
+      </w:r>
+      <w:r>
+        <w:rPr>
+          <w:lang w:val="en_US" w:bidi="en_US"/>
+        </w:rPr>
+      </w:r>
+      <w:r>
+        <w:rPr>
+          <w:lang w:val="en_US" w:bidi="en_US"/>
+        </w:rPr>
       </w:r>
     </w:p>
     <w:p>
@@ -1822,66 +2009,12 @@
         <w:rPr>
           <w:lang w:val="en_US" w:bidi="en_US"/>
         </w:rPr>
-        <w:t>Strong’s: H0223, G37740</w:t>
-      </w:r>
-      <w:r>
-        <w:rPr>
-          <w:lang w:val="en_US" w:bidi="en_US"/>
-        </w:rPr>
-      </w:r>
-      <w:r>
-        <w:rPr>
-          <w:lang w:val="en_US" w:bidi="en_US"/>
-        </w:rPr>
-      </w:r>
-    </w:p>
-    <w:p>
-      <w:pPr/>
-      <w:r>
-        <w:rPr>
-          <w:lang w:val="en_US" w:bidi="en_US"/>
-        </w:rPr>
-      </w:r>
-    </w:p>
-    <w:p>
-      <w:pPr>
-        <w:pStyle w:val="Heading2"/>
-      </w:pPr>
-      <w:r>
-        <w:rPr>
-          <w:lang w:val="en_US" w:bidi="en_US"/>
-        </w:rPr>
-        <w:t>Uzziah</w:t>
-      </w:r>
-      <w:r>
-        <w:rPr>
-          <w:lang w:val="en_US" w:bidi="en_US"/>
-        </w:rPr>
-      </w:r>
-    </w:p>
-    <w:p>
-      <w:pPr>
-        <w:pStyle w:val="Heading3"/>
-      </w:pPr>
-      <w:r>
-        <w:rPr>
-          <w:lang w:val="en_US" w:bidi="en_US"/>
-        </w:rPr>
-        <w:t>Facts:</w:t>
-      </w:r>
-    </w:p>
-    <w:p>
-      <w:pPr/>
-      <w:r>
-        <w:rPr>
-          <w:lang w:val="en_US" w:bidi="en_US"/>
-        </w:rPr>
-      </w:r>
-      <w:r>
-        <w:rPr>
-          <w:lang w:val="en_US" w:bidi="en_US"/>
-        </w:rPr>
-        <w:t>Uzziah became king of Judah at the age of 16 and reigned 52 years, which was an unusually long reign. Uzziah was also known as “Azariah.”</w:t>
+        <w:t>Genesis 9:20–21</w:t>
+      </w:r>
+      <w:r>
+        <w:rPr>
+          <w:lang w:val="en_US" w:bidi="en_US"/>
+        </w:rPr>
       </w:r>
     </w:p>
     <w:p>
@@ -1899,7 +2032,12 @@
         <w:rPr>
           <w:lang w:val="en_US" w:bidi="en_US"/>
         </w:rPr>
-        <w:t>King Uzziah was well-known for his organized and skilled military. He had towers built to protect the city and had specially-designed weapons of war mounted on them to hurl arrows and large stones.</w:t>
+        <w:t>Luke 13:6</w:t>
+      </w:r>
+      <w:r>
+        <w:rPr>
+          <w:lang w:val="en_US" w:bidi="en_US"/>
+        </w:rPr>
       </w:r>
     </w:p>
     <w:p>
@@ -1917,7 +2055,12 @@
         <w:rPr>
           <w:lang w:val="en_US" w:bidi="en_US"/>
         </w:rPr>
-        <w:t>As long as Uzziah served the Lord, he prospered. Toward the end of his reign, however, he became proud and he disobeyed the Lord by burning incense in the temple, which only the priest was permitted to do.</w:t>
+        <w:t>Luke 20:15</w:t>
+      </w:r>
+      <w:r>
+        <w:rPr>
+          <w:lang w:val="en_US" w:bidi="en_US"/>
+        </w:rPr>
       </w:r>
     </w:p>
     <w:p>
@@ -1935,106 +2078,12 @@
         <w:rPr>
           <w:lang w:val="en_US" w:bidi="en_US"/>
         </w:rPr>
-        <w:t>Because of this sin, Uzziah became sick with leprosy and had to live separately from other people until the end of his reign.</w:t>
-      </w:r>
-    </w:p>
-    <w:p>
-      <w:pPr/>
-      <w:r>
-        <w:rPr>
-          <w:lang w:val="en_US" w:bidi="en_US"/>
-        </w:rPr>
-      </w:r>
-      <w:r>
-        <w:rPr>
-          <w:lang w:val="en_US" w:bidi="en_US"/>
-        </w:rPr>
-        <w:t>(Translation suggestions: How to Translate Names)</w:t>
-      </w:r>
-    </w:p>
-    <w:p>
-      <w:pPr/>
-      <w:r>
-        <w:rPr>
-          <w:lang w:val="en_US" w:bidi="en_US"/>
-        </w:rPr>
-      </w:r>
-      <w:r>
-        <w:rPr>
-          <w:lang w:val="en_US" w:bidi="en_US"/>
-        </w:rPr>
-        <w:t xml:space="preserve">(See also: </w:t>
-      </w:r>
-      <w:r>
-        <w:rPr>
-          <w:lang w:val="en_US" w:bidi="en_US"/>
-        </w:rPr>
-        <w:t>Judah</w:t>
-      </w:r>
-      <w:r>
-        <w:rPr>
-          <w:lang w:val="en_US" w:bidi="en_US"/>
-        </w:rPr>
-        <w:t xml:space="preserve">, </w:t>
-      </w:r>
-      <w:r>
-        <w:rPr>
-          <w:lang w:val="en_US" w:bidi="en_US"/>
-        </w:rPr>
-        <w:t>king</w:t>
-      </w:r>
-      <w:r>
-        <w:rPr>
-          <w:lang w:val="en_US" w:bidi="en_US"/>
-        </w:rPr>
-        <w:t xml:space="preserve">, </w:t>
-      </w:r>
-      <w:r>
-        <w:rPr>
-          <w:lang w:val="en_US" w:bidi="en_US"/>
-        </w:rPr>
-        <w:t>leprosy</w:t>
-      </w:r>
-      <w:r>
-        <w:rPr>
-          <w:lang w:val="en_US" w:bidi="en_US"/>
-        </w:rPr>
-        <w:t xml:space="preserve">, </w:t>
-      </w:r>
-      <w:r>
-        <w:rPr>
-          <w:lang w:val="en_US" w:bidi="en_US"/>
-        </w:rPr>
-        <w:t>reign</w:t>
-      </w:r>
-      <w:r>
-        <w:rPr>
-          <w:lang w:val="en_US" w:bidi="en_US"/>
-        </w:rPr>
-        <w:t xml:space="preserve">, </w:t>
-      </w:r>
-      <w:r>
-        <w:rPr>
-          <w:lang w:val="en_US" w:bidi="en_US"/>
-        </w:rPr>
-        <w:t>watchtower</w:t>
-      </w:r>
-      <w:r>
-        <w:rPr>
-          <w:lang w:val="en_US" w:bidi="en_US"/>
-        </w:rPr>
-        <w:t>)</w:t>
-      </w:r>
-    </w:p>
-    <w:p>
-      <w:pPr>
-        <w:pStyle w:val="Heading3"/>
-      </w:pPr>
-      <w:r>
-        <w:rPr>
-          <w:lang w:val="en_US" w:bidi="en_US"/>
-        </w:rPr>
-        <w:t>Bible References:</w:t>
+        <w:t>Matthew 20:2</w:t>
+      </w:r>
+      <w:r>
+        <w:rPr>
+          <w:lang w:val="en_US" w:bidi="en_US"/>
+        </w:rPr>
       </w:r>
     </w:p>
     <w:p>
@@ -2048,18 +2097,43 @@
           <w:lang w:val="en_US" w:bidi="en_US"/>
         </w:rPr>
       </w:r>
-      <w:hyperlink r:id="rId34">
-        <w:r>
-          <w:rPr>
-            <w:lang w:val="en_US" w:bidi="en_US"/>
-          </w:rPr>
-          <w:rPr>
-            <w:color w:val="0000EE"/>
-            <w:u w:val="single"/>
-          </w:rPr>
-          <w:t>2 Kings 14:21</w:t>
-        </w:r>
-      </w:hyperlink>
+      <w:r>
+        <w:rPr>
+          <w:lang w:val="en_US" w:bidi="en_US"/>
+        </w:rPr>
+        <w:t>Matthew 21:40–41</w:t>
+      </w:r>
+      <w:r>
+        <w:rPr>
+          <w:lang w:val="en_US" w:bidi="en_US"/>
+        </w:rPr>
+      </w:r>
+      <w:r>
+        <w:rPr>
+          <w:lang w:val="en_US" w:bidi="en_US"/>
+        </w:rPr>
+      </w:r>
+    </w:p>
+    <w:p>
+      <w:pPr>
+        <w:pStyle w:val="Heading3"/>
+      </w:pPr>
+      <w:r>
+        <w:rPr>
+          <w:lang w:val="en_US" w:bidi="en_US"/>
+        </w:rPr>
+        <w:t>Word Data:</w:t>
+      </w:r>
+      <w:r>
+        <w:rPr>
+          <w:lang w:val="en_US" w:bidi="en_US"/>
+        </w:rPr>
+      </w:r>
+      <w:r>
+        <w:rPr>
+          <w:lang w:val="en_US" w:bidi="en_US"/>
+        </w:rPr>
+      </w:r>
     </w:p>
     <w:p>
       <w:pPr>
@@ -2072,18 +2146,91 @@
           <w:lang w:val="en_US" w:bidi="en_US"/>
         </w:rPr>
       </w:r>
-      <w:hyperlink r:id="rId35">
-        <w:r>
-          <w:rPr>
-            <w:lang w:val="en_US" w:bidi="en_US"/>
-          </w:rPr>
-          <w:rPr>
-            <w:color w:val="0000EE"/>
-            <w:u w:val="single"/>
-          </w:rPr>
-          <w:t>Amos 1:1</w:t>
-        </w:r>
-      </w:hyperlink>
+      <w:r>
+        <w:rPr>
+          <w:lang w:val="en_US" w:bidi="en_US"/>
+        </w:rPr>
+        <w:t>Strong’s: H1612, H3754, H3755, H8284, G02900</w:t>
+      </w:r>
+      <w:r>
+        <w:rPr>
+          <w:lang w:val="en_US" w:bidi="en_US"/>
+        </w:rPr>
+      </w:r>
+      <w:r>
+        <w:rPr>
+          <w:lang w:val="en_US" w:bidi="en_US"/>
+        </w:rPr>
+      </w:r>
+      <w:r>
+        <w:rPr>
+          <w:lang w:val="en_US" w:bidi="en_US"/>
+        </w:rPr>
+      </w:r>
+    </w:p>
+    <w:p>
+      <w:pPr/>
+      <w:r>
+        <w:rPr>
+          <w:lang w:val="en_US" w:bidi="en_US"/>
+        </w:rPr>
+      </w:r>
+    </w:p>
+    <w:p>
+      <w:pPr>
+        <w:pStyle w:val="Heading2"/>
+      </w:pPr>
+      <w:r>
+        <w:rPr>
+          <w:lang w:val="en_US" w:bidi="en_US"/>
+        </w:rPr>
+        <w:t>virgin, virginity</w:t>
+      </w:r>
+      <w:r>
+        <w:rPr>
+          <w:lang w:val="en_US" w:bidi="en_US"/>
+        </w:rPr>
+      </w:r>
+    </w:p>
+    <w:p>
+      <w:pPr>
+        <w:pStyle w:val="Heading3"/>
+      </w:pPr>
+      <w:r>
+        <w:rPr>
+          <w:lang w:val="en_US" w:bidi="en_US"/>
+        </w:rPr>
+        <w:t>Definition:</w:t>
+      </w:r>
+      <w:r>
+        <w:rPr>
+          <w:lang w:val="en_US" w:bidi="en_US"/>
+        </w:rPr>
+      </w:r>
+    </w:p>
+    <w:p>
+      <w:pPr/>
+      <w:r>
+        <w:rPr>
+          <w:lang w:val="en_US" w:bidi="en_US"/>
+        </w:rPr>
+      </w:r>
+      <w:r>
+        <w:rPr>
+          <w:lang w:val="en_US" w:bidi="en_US"/>
+        </w:rPr>
+        <w:t>A virgin is a woman who has never had sexual relations.</w:t>
+      </w:r>
+      <w:r>
+        <w:rPr>
+          <w:lang w:val="en_US" w:bidi="en_US"/>
+        </w:rPr>
+      </w:r>
+      <w:r>
+        <w:rPr>
+          <w:lang w:val="en_US" w:bidi="en_US"/>
+        </w:rPr>
+      </w:r>
     </w:p>
     <w:p>
       <w:pPr>
@@ -2096,18 +2243,17 @@
           <w:lang w:val="en_US" w:bidi="en_US"/>
         </w:rPr>
       </w:r>
-      <w:hyperlink r:id="rId36">
-        <w:r>
-          <w:rPr>
-            <w:lang w:val="en_US" w:bidi="en_US"/>
-          </w:rPr>
-          <w:rPr>
-            <w:color w:val="0000EE"/>
-            <w:u w:val="single"/>
-          </w:rPr>
-          <w:t>Hosea 1:1</w:t>
-        </w:r>
-      </w:hyperlink>
+      <w:r>
+        <w:rPr>
+          <w:lang w:val="en_US" w:bidi="en_US"/>
+        </w:rPr>
+        <w:t>The prophet Isaiah said that the Messiah would be born from a virgin.</w:t>
+      </w:r>
+      <w:r>
+        <w:rPr>
+          <w:lang w:val="en_US" w:bidi="en_US"/>
+        </w:rPr>
+      </w:r>
     </w:p>
     <w:p>
       <w:pPr>
@@ -2120,18 +2266,17 @@
           <w:lang w:val="en_US" w:bidi="en_US"/>
         </w:rPr>
       </w:r>
-      <w:hyperlink r:id="rId37">
-        <w:r>
-          <w:rPr>
-            <w:lang w:val="en_US" w:bidi="en_US"/>
-          </w:rPr>
-          <w:rPr>
-            <w:color w:val="0000EE"/>
-            <w:u w:val="single"/>
-          </w:rPr>
-          <w:t>Isaiah 6:1–2</w:t>
-        </w:r>
-      </w:hyperlink>
+      <w:r>
+        <w:rPr>
+          <w:lang w:val="en_US" w:bidi="en_US"/>
+        </w:rPr>
+        <w:t>Mary was a virgin when she was pregnant with Jesus. He did not have a human father.</w:t>
+      </w:r>
+      <w:r>
+        <w:rPr>
+          <w:lang w:val="en_US" w:bidi="en_US"/>
+        </w:rPr>
+      </w:r>
     </w:p>
     <w:p>
       <w:pPr>
@@ -2144,18 +2289,89 @@
           <w:lang w:val="en_US" w:bidi="en_US"/>
         </w:rPr>
       </w:r>
-      <w:hyperlink r:id="rId38">
-        <w:r>
-          <w:rPr>
-            <w:lang w:val="en_US" w:bidi="en_US"/>
-          </w:rPr>
-          <w:rPr>
-            <w:color w:val="0000EE"/>
-            <w:u w:val="single"/>
-          </w:rPr>
-          <w:t>Matthew 1:7–8</w:t>
-        </w:r>
-      </w:hyperlink>
+      <w:r>
+        <w:rPr>
+          <w:lang w:val="en_US" w:bidi="en_US"/>
+        </w:rPr>
+        <w:t>Some languages may have a term that is a polite way of referring to a virgin. (See: Euphemism)</w:t>
+      </w:r>
+      <w:r>
+        <w:rPr>
+          <w:lang w:val="en_US" w:bidi="en_US"/>
+        </w:rPr>
+      </w:r>
+      <w:r>
+        <w:rPr>
+          <w:lang w:val="en_US" w:bidi="en_US"/>
+        </w:rPr>
+      </w:r>
+    </w:p>
+    <w:p>
+      <w:pPr/>
+      <w:r>
+        <w:rPr>
+          <w:lang w:val="en_US" w:bidi="en_US"/>
+        </w:rPr>
+      </w:r>
+      <w:r>
+        <w:rPr>
+          <w:lang w:val="en_US" w:bidi="en_US"/>
+        </w:rPr>
+        <w:t xml:space="preserve">(See also: </w:t>
+      </w:r>
+      <w:r>
+        <w:rPr>
+          <w:lang w:val="en_US" w:bidi="en_US"/>
+        </w:rPr>
+        <w:t>Christ</w:t>
+      </w:r>
+      <w:r>
+        <w:rPr>
+          <w:lang w:val="en_US" w:bidi="en_US"/>
+        </w:rPr>
+        <w:t xml:space="preserve">, </w:t>
+      </w:r>
+      <w:r>
+        <w:rPr>
+          <w:lang w:val="en_US" w:bidi="en_US"/>
+        </w:rPr>
+        <w:t>Isaiah</w:t>
+      </w:r>
+      <w:r>
+        <w:rPr>
+          <w:lang w:val="en_US" w:bidi="en_US"/>
+        </w:rPr>
+        <w:t xml:space="preserve">, </w:t>
+      </w:r>
+      <w:r>
+        <w:rPr>
+          <w:lang w:val="en_US" w:bidi="en_US"/>
+        </w:rPr>
+        <w:t>Jesus</w:t>
+      </w:r>
+      <w:r>
+        <w:rPr>
+          <w:lang w:val="en_US" w:bidi="en_US"/>
+        </w:rPr>
+        <w:t xml:space="preserve">, </w:t>
+      </w:r>
+      <w:r>
+        <w:rPr>
+          <w:lang w:val="en_US" w:bidi="en_US"/>
+        </w:rPr>
+        <w:t>Mary</w:t>
+      </w:r>
+      <w:r>
+        <w:rPr>
+          <w:lang w:val="en_US" w:bidi="en_US"/>
+        </w:rPr>
+        <w:t>)</w:t>
+      </w:r>
+      <w:r>
+        <w:rPr>
+          <w:lang w:val="en_US" w:bidi="en_US"/>
+        </w:rPr>
+      </w:r>
     </w:p>
     <w:p>
       <w:pPr>
@@ -2165,7 +2381,17 @@
         <w:rPr>
           <w:lang w:val="en_US" w:bidi="en_US"/>
         </w:rPr>
-        <w:t>Word Data:</w:t>
+        <w:t>Bible References:</w:t>
+      </w:r>
+      <w:r>
+        <w:rPr>
+          <w:lang w:val="en_US" w:bidi="en_US"/>
+        </w:rPr>
+      </w:r>
+      <w:r>
+        <w:rPr>
+          <w:lang w:val="en_US" w:bidi="en_US"/>
+        </w:rPr>
       </w:r>
     </w:p>
     <w:p>
@@ -2183,7 +2409,823 @@
         <w:rPr>
           <w:lang w:val="en_US" w:bidi="en_US"/>
         </w:rPr>
-        <w:t>Strong’s: H5818, H5838, H5839</w:t>
+        <w:t>Genesis 24:15–16</w:t>
+      </w:r>
+      <w:r>
+        <w:rPr>
+          <w:lang w:val="en_US" w:bidi="en_US"/>
+        </w:rPr>
+      </w:r>
+    </w:p>
+    <w:p>
+      <w:pPr>
+        <w:pStyle w:val="ListBullet"/>
+        <w:spacing w:line="240" w:lineRule="auto"/>
+        <w:ind w:left="720"/>
+      </w:pPr>
+      <w:r>
+        <w:rPr>
+          <w:lang w:val="en_US" w:bidi="en_US"/>
+        </w:rPr>
+      </w:r>
+      <w:r>
+        <w:rPr>
+          <w:lang w:val="en_US" w:bidi="en_US"/>
+        </w:rPr>
+        <w:t>Luke 1:27</w:t>
+      </w:r>
+      <w:r>
+        <w:rPr>
+          <w:lang w:val="en_US" w:bidi="en_US"/>
+        </w:rPr>
+      </w:r>
+    </w:p>
+    <w:p>
+      <w:pPr>
+        <w:pStyle w:val="ListBullet"/>
+        <w:spacing w:line="240" w:lineRule="auto"/>
+        <w:ind w:left="720"/>
+      </w:pPr>
+      <w:r>
+        <w:rPr>
+          <w:lang w:val="en_US" w:bidi="en_US"/>
+        </w:rPr>
+      </w:r>
+      <w:r>
+        <w:rPr>
+          <w:lang w:val="en_US" w:bidi="en_US"/>
+        </w:rPr>
+        <w:t>Luke 1:35</w:t>
+      </w:r>
+      <w:r>
+        <w:rPr>
+          <w:lang w:val="en_US" w:bidi="en_US"/>
+        </w:rPr>
+      </w:r>
+    </w:p>
+    <w:p>
+      <w:pPr>
+        <w:pStyle w:val="ListBullet"/>
+        <w:spacing w:line="240" w:lineRule="auto"/>
+        <w:ind w:left="720"/>
+      </w:pPr>
+      <w:r>
+        <w:rPr>
+          <w:lang w:val="en_US" w:bidi="en_US"/>
+        </w:rPr>
+      </w:r>
+      <w:r>
+        <w:rPr>
+          <w:lang w:val="en_US" w:bidi="en_US"/>
+        </w:rPr>
+        <w:t>Matthew 1:23</w:t>
+      </w:r>
+      <w:r>
+        <w:rPr>
+          <w:lang w:val="en_US" w:bidi="en_US"/>
+        </w:rPr>
+      </w:r>
+    </w:p>
+    <w:p>
+      <w:pPr>
+        <w:pStyle w:val="ListBullet"/>
+        <w:spacing w:line="240" w:lineRule="auto"/>
+        <w:ind w:left="720"/>
+      </w:pPr>
+      <w:r>
+        <w:rPr>
+          <w:lang w:val="en_US" w:bidi="en_US"/>
+        </w:rPr>
+      </w:r>
+      <w:r>
+        <w:rPr>
+          <w:lang w:val="en_US" w:bidi="en_US"/>
+        </w:rPr>
+        <w:t>Matthew 25:2</w:t>
+      </w:r>
+      <w:r>
+        <w:rPr>
+          <w:lang w:val="en_US" w:bidi="en_US"/>
+        </w:rPr>
+      </w:r>
+      <w:r>
+        <w:rPr>
+          <w:lang w:val="en_US" w:bidi="en_US"/>
+        </w:rPr>
+      </w:r>
+    </w:p>
+    <w:p>
+      <w:pPr>
+        <w:pStyle w:val="Heading3"/>
+      </w:pPr>
+      <w:r>
+        <w:rPr>
+          <w:lang w:val="en_US" w:bidi="en_US"/>
+        </w:rPr>
+        <w:t>Examples from the Bible stories:</w:t>
+      </w:r>
+      <w:r>
+        <w:rPr>
+          <w:lang w:val="en_US" w:bidi="en_US"/>
+        </w:rPr>
+      </w:r>
+      <w:r>
+        <w:rPr>
+          <w:lang w:val="en_US" w:bidi="en_US"/>
+        </w:rPr>
+      </w:r>
+    </w:p>
+    <w:p>
+      <w:pPr>
+        <w:pStyle w:val="ListBullet"/>
+        <w:spacing w:line="240" w:lineRule="auto"/>
+        <w:ind w:left="720"/>
+      </w:pPr>
+      <w:r>
+        <w:rPr>
+          <w:lang w:val="en_US" w:bidi="en_US"/>
+        </w:rPr>
+      </w:r>
+      <w:r>
+        <w:rPr>
+          <w:b/>
+          <w:lang w:val="en_US" w:bidi="en_US"/>
+        </w:rPr>
+        <w:t>21:9</w:t>
+      </w:r>
+      <w:r>
+        <w:rPr>
+          <w:lang w:val="en_US" w:bidi="en_US"/>
+        </w:rPr>
+        <w:t xml:space="preserve"> The prophet Isaiah prophesied that the Messiah would be born from a </w:t>
+      </w:r>
+      <w:r>
+        <w:rPr>
+          <w:b/>
+          <w:lang w:val="en_US" w:bidi="en_US"/>
+        </w:rPr>
+        <w:t>virgin</w:t>
+      </w:r>
+      <w:r>
+        <w:rPr>
+          <w:lang w:val="en_US" w:bidi="en_US"/>
+        </w:rPr>
+        <w:t>.</w:t>
+      </w:r>
+      <w:r>
+        <w:rPr>
+          <w:lang w:val="en_US" w:bidi="en_US"/>
+        </w:rPr>
+      </w:r>
+    </w:p>
+    <w:p>
+      <w:pPr>
+        <w:pStyle w:val="ListBullet"/>
+        <w:spacing w:line="240" w:lineRule="auto"/>
+        <w:ind w:left="720"/>
+      </w:pPr>
+      <w:r>
+        <w:rPr>
+          <w:lang w:val="en_US" w:bidi="en_US"/>
+        </w:rPr>
+      </w:r>
+      <w:r>
+        <w:rPr>
+          <w:b/>
+          <w:lang w:val="en_US" w:bidi="en_US"/>
+        </w:rPr>
+        <w:t>22:4</w:t>
+      </w:r>
+      <w:r>
+        <w:rPr>
+          <w:lang w:val="en_US" w:bidi="en_US"/>
+        </w:rPr>
+        <w:t xml:space="preserve"> She (Mary) was a </w:t>
+      </w:r>
+      <w:r>
+        <w:rPr>
+          <w:b/>
+          <w:lang w:val="en_US" w:bidi="en_US"/>
+        </w:rPr>
+        <w:t>virgin</w:t>
+      </w:r>
+      <w:r>
+        <w:rPr>
+          <w:lang w:val="en_US" w:bidi="en_US"/>
+        </w:rPr>
+        <w:t xml:space="preserve"> and was engaged to be married to a man named Joseph.</w:t>
+      </w:r>
+      <w:r>
+        <w:rPr>
+          <w:lang w:val="en_US" w:bidi="en_US"/>
+        </w:rPr>
+      </w:r>
+    </w:p>
+    <w:p>
+      <w:pPr>
+        <w:pStyle w:val="ListBullet"/>
+        <w:spacing w:line="240" w:lineRule="auto"/>
+        <w:ind w:left="720"/>
+      </w:pPr>
+      <w:r>
+        <w:rPr>
+          <w:lang w:val="en_US" w:bidi="en_US"/>
+        </w:rPr>
+      </w:r>
+      <w:r>
+        <w:rPr>
+          <w:b/>
+          <w:lang w:val="en_US" w:bidi="en_US"/>
+        </w:rPr>
+        <w:t>22:5</w:t>
+      </w:r>
+      <w:r>
+        <w:rPr>
+          <w:lang w:val="en_US" w:bidi="en_US"/>
+        </w:rPr>
+        <w:t xml:space="preserve"> Mary replied, “How can this be, since I am a </w:t>
+      </w:r>
+      <w:r>
+        <w:rPr>
+          <w:b/>
+          <w:lang w:val="en_US" w:bidi="en_US"/>
+        </w:rPr>
+        <w:t>virgin</w:t>
+      </w:r>
+      <w:r>
+        <w:rPr>
+          <w:lang w:val="en_US" w:bidi="en_US"/>
+        </w:rPr>
+        <w:t>?”</w:t>
+      </w:r>
+      <w:r>
+        <w:rPr>
+          <w:lang w:val="en_US" w:bidi="en_US"/>
+        </w:rPr>
+      </w:r>
+    </w:p>
+    <w:p>
+      <w:pPr>
+        <w:pStyle w:val="ListBullet"/>
+        <w:spacing w:line="240" w:lineRule="auto"/>
+        <w:ind w:left="720"/>
+      </w:pPr>
+      <w:r>
+        <w:rPr>
+          <w:lang w:val="en_US" w:bidi="en_US"/>
+        </w:rPr>
+      </w:r>
+      <w:r>
+        <w:rPr>
+          <w:b/>
+          <w:lang w:val="en_US" w:bidi="en_US"/>
+        </w:rPr>
+        <w:t>49:1</w:t>
+      </w:r>
+      <w:r>
+        <w:rPr>
+          <w:lang w:val="en_US" w:bidi="en_US"/>
+        </w:rPr>
+        <w:t xml:space="preserve"> An angel told a </w:t>
+      </w:r>
+      <w:r>
+        <w:rPr>
+          <w:b/>
+          <w:lang w:val="en_US" w:bidi="en_US"/>
+        </w:rPr>
+        <w:t>virgin</w:t>
+      </w:r>
+      <w:r>
+        <w:rPr>
+          <w:lang w:val="en_US" w:bidi="en_US"/>
+        </w:rPr>
+        <w:t xml:space="preserve"> named Mary that she would give birth to God’s Son. So while she was still a </w:t>
+      </w:r>
+      <w:r>
+        <w:rPr>
+          <w:b/>
+          <w:lang w:val="en_US" w:bidi="en_US"/>
+        </w:rPr>
+        <w:t>virgin</w:t>
+      </w:r>
+      <w:r>
+        <w:rPr>
+          <w:lang w:val="en_US" w:bidi="en_US"/>
+        </w:rPr>
+        <w:t>, she gave birth to a son and named him Jesus.</w:t>
+      </w:r>
+      <w:r>
+        <w:rPr>
+          <w:lang w:val="en_US" w:bidi="en_US"/>
+        </w:rPr>
+      </w:r>
+      <w:r>
+        <w:rPr>
+          <w:lang w:val="en_US" w:bidi="en_US"/>
+        </w:rPr>
+      </w:r>
+    </w:p>
+    <w:p>
+      <w:pPr>
+        <w:pStyle w:val="Heading3"/>
+      </w:pPr>
+      <w:r>
+        <w:rPr>
+          <w:lang w:val="en_US" w:bidi="en_US"/>
+        </w:rPr>
+        <w:t>Word Data:</w:t>
+      </w:r>
+      <w:r>
+        <w:rPr>
+          <w:lang w:val="en_US" w:bidi="en_US"/>
+        </w:rPr>
+      </w:r>
+      <w:r>
+        <w:rPr>
+          <w:lang w:val="en_US" w:bidi="en_US"/>
+        </w:rPr>
+      </w:r>
+    </w:p>
+    <w:p>
+      <w:pPr>
+        <w:pStyle w:val="ListBullet"/>
+        <w:spacing w:line="240" w:lineRule="auto"/>
+        <w:ind w:left="720"/>
+      </w:pPr>
+      <w:r>
+        <w:rPr>
+          <w:lang w:val="en_US" w:bidi="en_US"/>
+        </w:rPr>
+      </w:r>
+      <w:r>
+        <w:rPr>
+          <w:lang w:val="en_US" w:bidi="en_US"/>
+        </w:rPr>
+        <w:t>Strong’s: H1330, H1331, G39320, G39330</w:t>
+      </w:r>
+      <w:r>
+        <w:rPr>
+          <w:lang w:val="en_US" w:bidi="en_US"/>
+        </w:rPr>
+      </w:r>
+      <w:r>
+        <w:rPr>
+          <w:lang w:val="en_US" w:bidi="en_US"/>
+        </w:rPr>
+      </w:r>
+      <w:r>
+        <w:rPr>
+          <w:lang w:val="en_US" w:bidi="en_US"/>
+        </w:rPr>
+      </w:r>
+    </w:p>
+    <w:p>
+      <w:pPr/>
+      <w:r>
+        <w:rPr>
+          <w:lang w:val="en_US" w:bidi="en_US"/>
+        </w:rPr>
+      </w:r>
+    </w:p>
+    <w:p>
+      <w:pPr>
+        <w:pStyle w:val="Heading2"/>
+      </w:pPr>
+      <w:r>
+        <w:rPr>
+          <w:lang w:val="en_US" w:bidi="en_US"/>
+        </w:rPr>
+        <w:t>vision, envision</w:t>
+      </w:r>
+      <w:r>
+        <w:rPr>
+          <w:lang w:val="en_US" w:bidi="en_US"/>
+        </w:rPr>
+      </w:r>
+    </w:p>
+    <w:p>
+      <w:pPr>
+        <w:pStyle w:val="Heading3"/>
+      </w:pPr>
+      <w:r>
+        <w:rPr>
+          <w:lang w:val="en_US" w:bidi="en_US"/>
+        </w:rPr>
+        <w:t>Definition:</w:t>
+      </w:r>
+      <w:r>
+        <w:rPr>
+          <w:lang w:val="en_US" w:bidi="en_US"/>
+        </w:rPr>
+      </w:r>
+    </w:p>
+    <w:p>
+      <w:pPr/>
+      <w:r>
+        <w:rPr>
+          <w:lang w:val="en_US" w:bidi="en_US"/>
+        </w:rPr>
+      </w:r>
+      <w:r>
+        <w:rPr>
+          <w:lang w:val="en_US" w:bidi="en_US"/>
+        </w:rPr>
+        <w:t>The term “vision” refers to something that a person sees. It especially refers to something unusual or supernatural that God shows people in order to give them a message.</w:t>
+      </w:r>
+      <w:r>
+        <w:rPr>
+          <w:lang w:val="en_US" w:bidi="en_US"/>
+        </w:rPr>
+      </w:r>
+      <w:r>
+        <w:rPr>
+          <w:lang w:val="en_US" w:bidi="en_US"/>
+        </w:rPr>
+      </w:r>
+    </w:p>
+    <w:p>
+      <w:pPr>
+        <w:pStyle w:val="ListBullet"/>
+        <w:spacing w:line="240" w:lineRule="auto"/>
+        <w:ind w:left="720"/>
+      </w:pPr>
+      <w:r>
+        <w:rPr>
+          <w:lang w:val="en_US" w:bidi="en_US"/>
+        </w:rPr>
+      </w:r>
+      <w:r>
+        <w:rPr>
+          <w:lang w:val="en_US" w:bidi="en_US"/>
+        </w:rPr>
+        <w:t>Usually, visions are seen while the person is awake. However, sometimes a vision is something a person sees in a dream while asleep.</w:t>
+      </w:r>
+      <w:r>
+        <w:rPr>
+          <w:lang w:val="en_US" w:bidi="en_US"/>
+        </w:rPr>
+      </w:r>
+    </w:p>
+    <w:p>
+      <w:pPr>
+        <w:pStyle w:val="ListBullet"/>
+        <w:spacing w:line="240" w:lineRule="auto"/>
+        <w:ind w:left="720"/>
+      </w:pPr>
+      <w:r>
+        <w:rPr>
+          <w:lang w:val="en_US" w:bidi="en_US"/>
+        </w:rPr>
+      </w:r>
+      <w:r>
+        <w:rPr>
+          <w:lang w:val="en_US" w:bidi="en_US"/>
+        </w:rPr>
+        <w:t>God sends visions to tell people something that is very important. For example, Peter was shown a vision to tell him that God wanted him to welcome Gentiles.</w:t>
+      </w:r>
+      <w:r>
+        <w:rPr>
+          <w:lang w:val="en_US" w:bidi="en_US"/>
+        </w:rPr>
+      </w:r>
+      <w:r>
+        <w:rPr>
+          <w:lang w:val="en_US" w:bidi="en_US"/>
+        </w:rPr>
+      </w:r>
+    </w:p>
+    <w:p>
+      <w:pPr>
+        <w:pStyle w:val="Heading3"/>
+      </w:pPr>
+      <w:r>
+        <w:rPr>
+          <w:lang w:val="en_US" w:bidi="en_US"/>
+        </w:rPr>
+        <w:t>Translation Suggestion</w:t>
+      </w:r>
+      <w:r>
+        <w:rPr>
+          <w:lang w:val="en_US" w:bidi="en_US"/>
+        </w:rPr>
+      </w:r>
+      <w:r>
+        <w:rPr>
+          <w:lang w:val="en_US" w:bidi="en_US"/>
+        </w:rPr>
+      </w:r>
+    </w:p>
+    <w:p>
+      <w:pPr>
+        <w:pStyle w:val="ListBullet"/>
+        <w:spacing w:line="240" w:lineRule="auto"/>
+        <w:ind w:left="720"/>
+      </w:pPr>
+      <w:r>
+        <w:rPr>
+          <w:lang w:val="en_US" w:bidi="en_US"/>
+        </w:rPr>
+      </w:r>
+      <w:r>
+        <w:rPr>
+          <w:lang w:val="en_US" w:bidi="en_US"/>
+        </w:rPr>
+        <w:t>The phrase “saw a vision” could be translated as “saw something unusual from God” or “God showed him something special.”</w:t>
+      </w:r>
+      <w:r>
+        <w:rPr>
+          <w:lang w:val="en_US" w:bidi="en_US"/>
+        </w:rPr>
+      </w:r>
+    </w:p>
+    <w:p>
+      <w:pPr>
+        <w:pStyle w:val="ListBullet"/>
+        <w:spacing w:line="240" w:lineRule="auto"/>
+        <w:ind w:left="720"/>
+      </w:pPr>
+      <w:r>
+        <w:rPr>
+          <w:lang w:val="en_US" w:bidi="en_US"/>
+        </w:rPr>
+      </w:r>
+      <w:r>
+        <w:rPr>
+          <w:lang w:val="en_US" w:bidi="en_US"/>
+        </w:rPr>
+        <w:t>Some languages may not have separate words for “vision” and “dream.” So a sentence such as “Daniel had dreams and visions in his mind” could be translated as something like “Daniel was dreaming while asleep and God caused him to see unusual things.”</w:t>
+      </w:r>
+      <w:r>
+        <w:rPr>
+          <w:lang w:val="en_US" w:bidi="en_US"/>
+        </w:rPr>
+      </w:r>
+      <w:r>
+        <w:rPr>
+          <w:lang w:val="en_US" w:bidi="en_US"/>
+        </w:rPr>
+      </w:r>
+    </w:p>
+    <w:p>
+      <w:pPr/>
+      <w:r>
+        <w:rPr>
+          <w:lang w:val="en_US" w:bidi="en_US"/>
+        </w:rPr>
+      </w:r>
+      <w:r>
+        <w:rPr>
+          <w:lang w:val="en_US" w:bidi="en_US"/>
+        </w:rPr>
+        <w:t xml:space="preserve">(See also: </w:t>
+      </w:r>
+      <w:r>
+        <w:rPr>
+          <w:lang w:val="en_US" w:bidi="en_US"/>
+        </w:rPr>
+        <w:t>dream</w:t>
+      </w:r>
+      <w:r>
+        <w:rPr>
+          <w:lang w:val="en_US" w:bidi="en_US"/>
+        </w:rPr>
+        <w:t>)</w:t>
+      </w:r>
+      <w:r>
+        <w:rPr>
+          <w:lang w:val="en_US" w:bidi="en_US"/>
+        </w:rPr>
+      </w:r>
+    </w:p>
+    <w:p>
+      <w:pPr>
+        <w:pStyle w:val="Heading3"/>
+      </w:pPr>
+      <w:r>
+        <w:rPr>
+          <w:lang w:val="en_US" w:bidi="en_US"/>
+        </w:rPr>
+        <w:t>Bible References:</w:t>
+      </w:r>
+      <w:r>
+        <w:rPr>
+          <w:lang w:val="en_US" w:bidi="en_US"/>
+        </w:rPr>
+      </w:r>
+      <w:r>
+        <w:rPr>
+          <w:lang w:val="en_US" w:bidi="en_US"/>
+        </w:rPr>
+      </w:r>
+    </w:p>
+    <w:p>
+      <w:pPr>
+        <w:pStyle w:val="ListBullet"/>
+        <w:spacing w:line="240" w:lineRule="auto"/>
+        <w:ind w:left="720"/>
+      </w:pPr>
+      <w:r>
+        <w:rPr>
+          <w:lang w:val="en_US" w:bidi="en_US"/>
+        </w:rPr>
+      </w:r>
+      <w:r>
+        <w:rPr>
+          <w:lang w:val="en_US" w:bidi="en_US"/>
+        </w:rPr>
+        <w:t>Acts 9:10–12</w:t>
+      </w:r>
+      <w:r>
+        <w:rPr>
+          <w:lang w:val="en_US" w:bidi="en_US"/>
+        </w:rPr>
+      </w:r>
+    </w:p>
+    <w:p>
+      <w:pPr>
+        <w:pStyle w:val="ListBullet"/>
+        <w:spacing w:line="240" w:lineRule="auto"/>
+        <w:ind w:left="720"/>
+      </w:pPr>
+      <w:r>
+        <w:rPr>
+          <w:lang w:val="en_US" w:bidi="en_US"/>
+        </w:rPr>
+      </w:r>
+      <w:r>
+        <w:rPr>
+          <w:lang w:val="en_US" w:bidi="en_US"/>
+        </w:rPr>
+        <w:t>Acts 10:3–6</w:t>
+      </w:r>
+      <w:r>
+        <w:rPr>
+          <w:lang w:val="en_US" w:bidi="en_US"/>
+        </w:rPr>
+      </w:r>
+    </w:p>
+    <w:p>
+      <w:pPr>
+        <w:pStyle w:val="ListBullet"/>
+        <w:spacing w:line="240" w:lineRule="auto"/>
+        <w:ind w:left="720"/>
+      </w:pPr>
+      <w:r>
+        <w:rPr>
+          <w:lang w:val="en_US" w:bidi="en_US"/>
+        </w:rPr>
+      </w:r>
+      <w:r>
+        <w:rPr>
+          <w:lang w:val="en_US" w:bidi="en_US"/>
+        </w:rPr>
+        <w:t>Acts 10:11</w:t>
+      </w:r>
+      <w:r>
+        <w:rPr>
+          <w:lang w:val="en_US" w:bidi="en_US"/>
+        </w:rPr>
+      </w:r>
+    </w:p>
+    <w:p>
+      <w:pPr>
+        <w:pStyle w:val="ListBullet"/>
+        <w:spacing w:line="240" w:lineRule="auto"/>
+        <w:ind w:left="720"/>
+      </w:pPr>
+      <w:r>
+        <w:rPr>
+          <w:lang w:val="en_US" w:bidi="en_US"/>
+        </w:rPr>
+      </w:r>
+      <w:r>
+        <w:rPr>
+          <w:lang w:val="en_US" w:bidi="en_US"/>
+        </w:rPr>
+        <w:t>Acts 12:9–10</w:t>
+      </w:r>
+      <w:r>
+        <w:rPr>
+          <w:lang w:val="en_US" w:bidi="en_US"/>
+        </w:rPr>
+      </w:r>
+    </w:p>
+    <w:p>
+      <w:pPr>
+        <w:pStyle w:val="ListBullet"/>
+        <w:spacing w:line="240" w:lineRule="auto"/>
+        <w:ind w:left="720"/>
+      </w:pPr>
+      <w:r>
+        <w:rPr>
+          <w:lang w:val="en_US" w:bidi="en_US"/>
+        </w:rPr>
+      </w:r>
+      <w:r>
+        <w:rPr>
+          <w:lang w:val="en_US" w:bidi="en_US"/>
+        </w:rPr>
+        <w:t>Luke 1:22</w:t>
+      </w:r>
+      <w:r>
+        <w:rPr>
+          <w:lang w:val="en_US" w:bidi="en_US"/>
+        </w:rPr>
+      </w:r>
+    </w:p>
+    <w:p>
+      <w:pPr>
+        <w:pStyle w:val="ListBullet"/>
+        <w:spacing w:line="240" w:lineRule="auto"/>
+        <w:ind w:left="720"/>
+      </w:pPr>
+      <w:r>
+        <w:rPr>
+          <w:lang w:val="en_US" w:bidi="en_US"/>
+        </w:rPr>
+      </w:r>
+      <w:r>
+        <w:rPr>
+          <w:lang w:val="en_US" w:bidi="en_US"/>
+        </w:rPr>
+        <w:t>Luke 24:23</w:t>
+      </w:r>
+      <w:r>
+        <w:rPr>
+          <w:lang w:val="en_US" w:bidi="en_US"/>
+        </w:rPr>
+      </w:r>
+    </w:p>
+    <w:p>
+      <w:pPr>
+        <w:pStyle w:val="ListBullet"/>
+        <w:spacing w:line="240" w:lineRule="auto"/>
+        <w:ind w:left="720"/>
+      </w:pPr>
+      <w:r>
+        <w:rPr>
+          <w:lang w:val="en_US" w:bidi="en_US"/>
+        </w:rPr>
+      </w:r>
+      <w:r>
+        <w:rPr>
+          <w:lang w:val="en_US" w:bidi="en_US"/>
+        </w:rPr>
+        <w:t>Matthew 17:9–10</w:t>
+      </w:r>
+      <w:r>
+        <w:rPr>
+          <w:lang w:val="en_US" w:bidi="en_US"/>
+        </w:rPr>
+      </w:r>
+      <w:r>
+        <w:rPr>
+          <w:lang w:val="en_US" w:bidi="en_US"/>
+        </w:rPr>
+      </w:r>
+    </w:p>
+    <w:p>
+      <w:pPr>
+        <w:pStyle w:val="Heading3"/>
+      </w:pPr>
+      <w:r>
+        <w:rPr>
+          <w:lang w:val="en_US" w:bidi="en_US"/>
+        </w:rPr>
+        <w:t>Word Data:</w:t>
+      </w:r>
+      <w:r>
+        <w:rPr>
+          <w:lang w:val="en_US" w:bidi="en_US"/>
+        </w:rPr>
+      </w:r>
+      <w:r>
+        <w:rPr>
+          <w:lang w:val="en_US" w:bidi="en_US"/>
+        </w:rPr>
+      </w:r>
+    </w:p>
+    <w:p>
+      <w:pPr>
+        <w:pStyle w:val="ListBullet"/>
+        <w:spacing w:line="240" w:lineRule="auto"/>
+        <w:ind w:left="720"/>
+      </w:pPr>
+      <w:r>
+        <w:rPr>
+          <w:lang w:val="en_US" w:bidi="en_US"/>
+        </w:rPr>
+      </w:r>
+      <w:r>
+        <w:rPr>
+          <w:lang w:val="en_US" w:bidi="en_US"/>
+        </w:rPr>
+        <w:t>Strong’s: H2376, H2377, H2378, H2380, H2384, H4236, H4758, H4759, H7203, H7723, H8602, G37010, G37050, G37060</w:t>
+      </w:r>
+      <w:r>
+        <w:rPr>
+          <w:lang w:val="en_US" w:bidi="en_US"/>
+        </w:rPr>
       </w:r>
       <w:r>
         <w:rPr>

</xml_diff>